<commit_message>
vbhc-vn 2.30.0, hnh 1.14.0, hl-vlncn 1.4.8, tkm 1.4.4, sd-vlncn 2026.10.13.1: TTHC không gửi Ban Giám đốc Sở; Nơi nhận cỡ 11; khối ký cách thân 1 dòng; quét phông Times New Roman
- vbhc-vn: scripts/chuan_hoa_xuat_ban.py (mới, TemplateDoc.save và build_vb tự gọi); qa_rules R19 phông, R20 Nơi nhận cỡ 11, R21 1 dòng trước khối ký (WARN, FAIL khi --final), R22 TTHC gửi Ban Giám đốc Sở (FAIL); 4 file lỗi r19-r22; baseline WARN cập nhật; 2 mẫu thật TTHC bỏ dòng Ban Giám đốc Sở; SKILL.md Quy tắc 11.
- hnh-sct-vn: ref 16 và Mẫu 5 Giấy phép (Sở) bỏ Ban GĐ Sở, chuẩn phông.
- hl-vlncn-sct-vn, tkm-sct-vn, sd-vlncn-sct-vn: mẫu văn bản TTHC bỏ Ban Giám đốc Sở.
- check_facts.py: rule tthc-khong-gui-ban-giam-doc-so.

Co-Authored-By: Claude Opus 5.5 <noreply@anthropic.com>
Claude-Session: https://claude.ai/code/session_01FB6g7YJgKmnPUt1Wvqr1KY
</commit_message>
<xml_diff>
--- a/hnh-sct-vn/skills/hnh-sct-vn/mau-ho-so/Mau 5 - Giay phep van chuyen HHNH (So Cong Thuong).docx
+++ b/hnh-sct-vn/skills/hnh-sct-vn/mau-ho-so/Mau 5 - Giay phep van chuyen HHNH (So Cong Thuong).docx
@@ -24,7 +24,7 @@
             <w:pPr>
               <w:jc w:val="center"/>
               <w:rPr>
-                <w:rFonts w:ascii="Times New Roman" w:hAnsi="Times New Roman"/>
+                <w:rFonts w:ascii="Times New Roman" w:hAnsi="Times New Roman" w:eastAsia="Times New Roman" w:cs="Times New Roman"/>
                 <w:bCs/>
                 <w:i/>
                 <w:szCs w:val="28"/>
@@ -32,7 +32,7 @@
             </w:pPr>
             <w:r>
               <w:rPr>
-                <w:rFonts w:ascii="Times New Roman" w:hAnsi="Times New Roman"/>
+                <w:rFonts w:ascii="Times New Roman" w:hAnsi="Times New Roman" w:eastAsia="Times New Roman" w:cs="Times New Roman"/>
                 <w:sz w:val="26"/>
                 <w:szCs w:val="28"/>
               </w:rPr>
@@ -49,7 +49,7 @@
             <w:pPr>
               <w:jc w:val="center"/>
               <w:rPr>
-                <w:rFonts w:ascii="Times New Roman" w:hAnsi="Times New Roman"/>
+                <w:rFonts w:ascii="Times New Roman" w:hAnsi="Times New Roman" w:eastAsia="Times New Roman" w:cs="Times New Roman"/>
                 <w:b/>
                 <w:bCs/>
                 <w:spacing w:val="2"/>
@@ -59,7 +59,7 @@
             </w:pPr>
             <w:r>
               <w:rPr>
-                <w:rFonts w:ascii="Times New Roman" w:hAnsi="Times New Roman"/>
+                <w:rFonts w:ascii="Times New Roman" w:hAnsi="Times New Roman" w:eastAsia="Times New Roman" w:cs="Times New Roman"/>
                 <w:b/>
                 <w:bCs/>
                 <w:spacing w:val="2"/>
@@ -84,7 +84,7 @@
             <w:pPr>
               <w:jc w:val="center"/>
               <w:rPr>
-                <w:rFonts w:ascii="Times New Roman" w:hAnsi="Times New Roman"/>
+                <w:rFonts w:ascii="Times New Roman" w:hAnsi="Times New Roman" w:eastAsia="Times New Roman" w:cs="Times New Roman"/>
                 <w:b/>
                 <w:bCs/>
                 <w:spacing w:val="-20"/>
@@ -94,7 +94,7 @@
             </w:pPr>
             <w:r>
               <w:rPr>
-                <w:rFonts w:ascii="Times New Roman" w:hAnsi="Times New Roman"/>
+                <w:rFonts w:ascii="Times New Roman" w:hAnsi="Times New Roman" w:eastAsia="Times New Roman" w:cs="Times New Roman"/>
                 <w:noProof/>
                 <w:szCs w:val="22"/>
               </w:rPr>
@@ -169,7 +169,7 @@
             </w:r>
             <w:r>
               <w:rPr>
-                <w:rFonts w:ascii="Times New Roman" w:hAnsi="Times New Roman"/>
+                <w:rFonts w:ascii="Times New Roman" w:hAnsi="Times New Roman" w:eastAsia="Times New Roman" w:cs="Times New Roman"/>
                 <w:b/>
                 <w:bCs/>
                 <w:szCs w:val="34"/>
@@ -187,7 +187,7 @@
             <w:pPr>
               <w:jc w:val="center"/>
               <w:rPr>
-                <w:rFonts w:ascii="Times New Roman" w:hAnsi="Times New Roman"/>
+                <w:rFonts w:ascii="Times New Roman" w:hAnsi="Times New Roman" w:eastAsia="Times New Roman" w:cs="Times New Roman"/>
                 <w:b/>
                 <w:bCs/>
                 <w:spacing w:val="2"/>
@@ -196,7 +196,7 @@
             </w:pPr>
             <w:r>
               <w:rPr>
-                <w:rFonts w:ascii="Times New Roman" w:hAnsi="Times New Roman"/>
+                <w:rFonts w:ascii="Times New Roman" w:hAnsi="Times New Roman" w:eastAsia="Times New Roman" w:cs="Times New Roman"/>
                 <w:noProof/>
                 <w:spacing w:val="2"/>
               </w:rPr>
@@ -271,7 +271,7 @@
             </w:r>
             <w:r>
               <w:rPr>
-                <w:rFonts w:ascii="Times New Roman" w:hAnsi="Times New Roman"/>
+                <w:rFonts w:ascii="Times New Roman" w:hAnsi="Times New Roman" w:eastAsia="Times New Roman" w:cs="Times New Roman"/>
                 <w:b/>
                 <w:bCs/>
                 <w:spacing w:val="2"/>
@@ -292,7 +292,7 @@
             <w:pPr>
               <w:jc w:val="center"/>
               <w:rPr>
-                <w:rFonts w:ascii="Times New Roman" w:hAnsi="Times New Roman"/>
+                <w:rFonts w:ascii="Times New Roman" w:hAnsi="Times New Roman" w:eastAsia="Times New Roman" w:cs="Times New Roman"/>
                 <w:b/>
                 <w:bCs/>
                 <w:spacing w:val="-20"/>
@@ -302,7 +302,7 @@
             </w:pPr>
             <w:r>
               <w:rPr>
-                <w:rFonts w:ascii="Times New Roman" w:hAnsi="Times New Roman"/>
+                <w:rFonts w:ascii="Times New Roman" w:hAnsi="Times New Roman" w:eastAsia="Times New Roman" w:cs="Times New Roman"/>
                 <w:bCs/>
                 <w:szCs w:val="28"/>
               </w:rPr>
@@ -310,7 +310,7 @@
             </w:r>
             <w:r>
               <w:rPr>
-                <w:rFonts w:ascii="Times New Roman" w:hAnsi="Times New Roman"/>
+                <w:rFonts w:ascii="Times New Roman" w:hAnsi="Times New Roman" w:eastAsia="Times New Roman" w:cs="Times New Roman"/>
                 <w:b/>
                 <w:szCs w:val="28"/>
               </w:rPr>
@@ -318,7 +318,7 @@
             </w:r>
             <w:r>
               <w:rPr>
-                <w:rFonts w:ascii="Times New Roman" w:hAnsi="Times New Roman"/>
+                <w:rFonts w:ascii="Times New Roman" w:hAnsi="Times New Roman" w:eastAsia="Times New Roman" w:cs="Times New Roman"/>
                 <w:b/>
                 <w:bCs/>
                 <w:szCs w:val="28"/>
@@ -327,7 +327,7 @@
             </w:r>
             <w:r>
               <w:rPr>
-                <w:rFonts w:ascii="Times New Roman" w:hAnsi="Times New Roman"/>
+                <w:rFonts w:ascii="Times New Roman" w:hAnsi="Times New Roman" w:eastAsia="Times New Roman" w:cs="Times New Roman"/>
                 <w:bCs/>
                 <w:szCs w:val="28"/>
               </w:rPr>
@@ -343,7 +343,7 @@
             <w:pPr>
               <w:jc w:val="center"/>
               <w:rPr>
-                <w:rFonts w:ascii="Times New Roman" w:hAnsi="Times New Roman"/>
+                <w:rFonts w:ascii="Times New Roman" w:hAnsi="Times New Roman" w:eastAsia="Times New Roman" w:cs="Times New Roman"/>
                 <w:b/>
                 <w:bCs/>
                 <w:spacing w:val="-20"/>
@@ -361,7 +361,7 @@
         <w:ind w:left="57" w:hanging="57"/>
         <w:jc w:val="center"/>
         <w:rPr>
-          <w:rFonts w:ascii="Times New Roman" w:hAnsi="Times New Roman"/>
+          <w:rFonts w:ascii="Times New Roman" w:hAnsi="Times New Roman" w:eastAsia="Times New Roman" w:cs="Times New Roman"/>
           <w:b/>
           <w:szCs w:val="28"/>
         </w:rPr>
@@ -373,14 +373,14 @@
         <w:ind w:left="57" w:hanging="57"/>
         <w:jc w:val="center"/>
         <w:rPr>
-          <w:rFonts w:ascii="Times New Roman" w:hAnsi="Times New Roman"/>
+          <w:rFonts w:ascii="Times New Roman" w:hAnsi="Times New Roman" w:eastAsia="Times New Roman" w:cs="Times New Roman"/>
           <w:b/>
           <w:szCs w:val="28"/>
         </w:rPr>
       </w:pPr>
       <w:r>
         <w:rPr>
-          <w:rFonts w:ascii="Times New Roman" w:hAnsi="Times New Roman"/>
+          <w:rFonts w:ascii="Times New Roman" w:hAnsi="Times New Roman" w:eastAsia="Times New Roman" w:cs="Times New Roman"/>
           <w:b/>
           <w:szCs w:val="28"/>
         </w:rPr>
@@ -393,14 +393,14 @@
         <w:ind w:left="57" w:hanging="57"/>
         <w:jc w:val="center"/>
         <w:rPr>
-          <w:rFonts w:ascii="Times New Roman" w:hAnsi="Times New Roman"/>
+          <w:rFonts w:ascii="Times New Roman" w:hAnsi="Times New Roman" w:eastAsia="Times New Roman" w:cs="Times New Roman"/>
           <w:b/>
           <w:szCs w:val="28"/>
         </w:rPr>
       </w:pPr>
       <w:r>
         <w:rPr>
-          <w:rFonts w:ascii="Times New Roman" w:hAnsi="Times New Roman"/>
+          <w:rFonts w:ascii="Times New Roman" w:hAnsi="Times New Roman" w:eastAsia="Times New Roman" w:cs="Times New Roman"/>
           <w:b/>
           <w:szCs w:val="28"/>
         </w:rPr>
@@ -414,14 +414,14 @@
         <w:ind w:left="-142"/>
         <w:jc w:val="center"/>
         <w:rPr>
-          <w:rFonts w:ascii="Times New Roman" w:hAnsi="Times New Roman"/>
+          <w:rFonts w:ascii="Times New Roman" w:hAnsi="Times New Roman" w:eastAsia="Times New Roman" w:cs="Times New Roman"/>
           <w:sz w:val="27"/>
           <w:szCs w:val="27"/>
         </w:rPr>
       </w:pPr>
       <w:r>
         <w:rPr>
-          <w:rFonts w:ascii="Times New Roman" w:hAnsi="Times New Roman"/>
+          <w:rFonts w:ascii="Times New Roman" w:hAnsi="Times New Roman" w:eastAsia="Times New Roman" w:cs="Times New Roman"/>
           <w:noProof/>
           <w:sz w:val="27"/>
           <w:szCs w:val="27"/>
@@ -503,12 +503,12 @@
         <w:ind w:left="-142"/>
         <w:jc w:val="center"/>
         <w:rPr>
-          <w:rFonts w:ascii="Times New Roman" w:hAnsi="Times New Roman"/>
+          <w:rFonts w:ascii="Times New Roman" w:hAnsi="Times New Roman" w:eastAsia="Times New Roman" w:cs="Times New Roman"/>
         </w:rPr>
       </w:pPr>
       <w:r>
         <w:rPr>
-          <w:rFonts w:ascii="Times New Roman" w:hAnsi="Times New Roman"/>
+          <w:rFonts w:ascii="Times New Roman" w:hAnsi="Times New Roman" w:eastAsia="Times New Roman" w:cs="Times New Roman"/>
           <w:szCs w:val="28"/>
         </w:rPr>
         <w:t>Theo đề nghị của: (tên tổ chức được cấp phép),</w:t>
@@ -521,12 +521,12 @@
         <w:ind w:left="-142"/>
         <w:jc w:val="center"/>
         <w:rPr>
-          <w:rFonts w:ascii="Times New Roman" w:hAnsi="Times New Roman"/>
+          <w:rFonts w:ascii="Times New Roman" w:hAnsi="Times New Roman" w:eastAsia="Times New Roman" w:cs="Times New Roman"/>
         </w:rPr>
       </w:pPr>
       <w:r>
         <w:rPr>
-          <w:rFonts w:ascii="Times New Roman" w:hAnsi="Times New Roman"/>
+          <w:rFonts w:ascii="Times New Roman" w:hAnsi="Times New Roman" w:eastAsia="Times New Roman" w:cs="Times New Roman"/>
           <w:szCs w:val="28"/>
         </w:rPr>
         <w:t>Sở Công Thương tỉnh Lào Cai cho phép:</w:t>
@@ -538,13 +538,13 @@
         <w:spacing w:before="120" w:line="380" w:lineRule="exact"/>
         <w:ind w:firstLine="567"/>
         <w:rPr>
-          <w:rFonts w:ascii="Times New Roman" w:hAnsi="Times New Roman"/>
+          <w:rFonts w:ascii="Times New Roman" w:hAnsi="Times New Roman" w:eastAsia="Times New Roman" w:cs="Times New Roman"/>
           <w:spacing w:val="-4"/>
         </w:rPr>
       </w:pPr>
       <w:r>
         <w:rPr>
-          <w:rFonts w:ascii="Times New Roman" w:hAnsi="Times New Roman"/>
+          <w:rFonts w:ascii="Times New Roman" w:hAnsi="Times New Roman" w:eastAsia="Times New Roman" w:cs="Times New Roman"/>
           <w:spacing w:val="-4"/>
           <w:szCs w:val="28"/>
         </w:rPr>
@@ -557,13 +557,13 @@
         <w:spacing w:before="120" w:line="380" w:lineRule="exact"/>
         <w:ind w:firstLine="567"/>
         <w:rPr>
-          <w:rFonts w:ascii="Times New Roman" w:hAnsi="Times New Roman"/>
+          <w:rFonts w:ascii="Times New Roman" w:hAnsi="Times New Roman" w:eastAsia="Times New Roman" w:cs="Times New Roman"/>
           <w:szCs w:val="28"/>
         </w:rPr>
       </w:pPr>
       <w:r>
         <w:rPr>
-          <w:rFonts w:ascii="Times New Roman" w:hAnsi="Times New Roman"/>
+          <w:rFonts w:ascii="Times New Roman" w:hAnsi="Times New Roman" w:eastAsia="Times New Roman" w:cs="Times New Roman"/>
           <w:szCs w:val="28"/>
         </w:rPr>
         <w:t>Số định danh cá nhân/Giấy CNĐKKD: ................ do Phòng Doanh nghiệp - Sở Tài chính tỉnh Lào Cai cấp đăng ký lần đầu ngày .............., thay đổi lần thứ ... ngày ...............</w:t>
@@ -575,13 +575,13 @@
         <w:spacing w:before="120" w:line="380" w:lineRule="exact"/>
         <w:ind w:firstLine="567"/>
         <w:rPr>
-          <w:rFonts w:ascii="Times New Roman" w:hAnsi="Times New Roman"/>
+          <w:rFonts w:ascii="Times New Roman" w:hAnsi="Times New Roman" w:eastAsia="Times New Roman" w:cs="Times New Roman"/>
           <w:szCs w:val="28"/>
         </w:rPr>
       </w:pPr>
       <w:r>
         <w:rPr>
-          <w:rFonts w:ascii="Times New Roman" w:hAnsi="Times New Roman"/>
+          <w:rFonts w:ascii="Times New Roman" w:hAnsi="Times New Roman" w:eastAsia="Times New Roman" w:cs="Times New Roman"/>
           <w:szCs w:val="28"/>
         </w:rPr>
         <w:t>Địa chỉ trụ sở chính: (địa chỉ trụ sở). Điện thoại: (số điện thoại).</w:t>
@@ -595,13 +595,13 @@
         <w:spacing w:before="120" w:line="380" w:lineRule="exact"/>
         <w:ind w:firstLine="567"/>
         <w:rPr>
-          <w:rFonts w:ascii="Times New Roman" w:hAnsi="Times New Roman"/>
+          <w:rFonts w:ascii="Times New Roman" w:hAnsi="Times New Roman" w:eastAsia="Times New Roman" w:cs="Times New Roman"/>
           <w:szCs w:val="28"/>
         </w:rPr>
       </w:pPr>
       <w:r>
         <w:rPr>
-          <w:rFonts w:ascii="Times New Roman" w:hAnsi="Times New Roman"/>
+          <w:rFonts w:ascii="Times New Roman" w:hAnsi="Times New Roman" w:eastAsia="Times New Roman" w:cs="Times New Roman"/>
           <w:spacing w:val="-4"/>
           <w:szCs w:val="28"/>
         </w:rPr>
@@ -614,13 +614,13 @@
         <w:spacing w:before="120" w:line="380" w:lineRule="exact"/>
         <w:ind w:firstLine="567"/>
         <w:rPr>
-          <w:rFonts w:ascii="Times New Roman" w:hAnsi="Times New Roman"/>
+          <w:rFonts w:ascii="Times New Roman" w:hAnsi="Times New Roman" w:eastAsia="Times New Roman" w:cs="Times New Roman"/>
           <w:szCs w:val="28"/>
         </w:rPr>
       </w:pPr>
       <w:r>
         <w:rPr>
-          <w:rFonts w:ascii="Times New Roman" w:hAnsi="Times New Roman"/>
+          <w:rFonts w:ascii="Times New Roman" w:hAnsi="Times New Roman" w:eastAsia="Times New Roman" w:cs="Times New Roman"/>
           <w:szCs w:val="28"/>
         </w:rPr>
         <w:t>Được phép vận chuyển hàng hóa nguy hiểm: (loại ...); (tên tổ chức được cấp phép) phải có trách nhiệm duy trì các điều kiện an toàn về vận chuyển hàng hóa nguy hiểm của phương tiện và chấp hành đầy đủ các quy định về hàng hóa nguy hiểm trong suốt quá trình vận chuyển (Danh mục kèm theo Giấy phép này).</w:t>
@@ -632,27 +632,27 @@
         <w:spacing w:before="120" w:line="380" w:lineRule="exact"/>
         <w:ind w:firstLine="567"/>
         <w:rPr>
-          <w:rFonts w:ascii="Times New Roman" w:hAnsi="Times New Roman"/>
+          <w:rFonts w:ascii="Times New Roman" w:hAnsi="Times New Roman" w:eastAsia="Times New Roman" w:cs="Times New Roman"/>
           <w:szCs w:val="28"/>
         </w:rPr>
       </w:pPr>
       <w:r>
         <w:rPr>
-          <w:rFonts w:ascii="Times New Roman" w:hAnsi="Times New Roman"/>
+          <w:rFonts w:ascii="Times New Roman" w:hAnsi="Times New Roman" w:eastAsia="Times New Roman" w:cs="Times New Roman"/>
           <w:szCs w:val="28"/>
         </w:rPr>
         <w:t>Thời hạn của giấy phép:</w:t>
       </w:r>
       <w:r>
         <w:rPr>
-          <w:rFonts w:ascii="Times New Roman" w:hAnsi="Times New Roman"/>
+          <w:rFonts w:ascii="Times New Roman" w:hAnsi="Times New Roman" w:eastAsia="Times New Roman" w:cs="Times New Roman"/>
           <w:szCs w:val="28"/>
         </w:rPr>
         <w:t xml:space="preserve"> 24 tháng kể từ ngày ký</w:t>
       </w:r>
       <w:r>
         <w:rPr>
-          <w:rFonts w:ascii="Times New Roman" w:hAnsi="Times New Roman"/>
+          <w:rFonts w:ascii="Times New Roman" w:hAnsi="Times New Roman" w:eastAsia="Times New Roman" w:cs="Times New Roman"/>
           <w:szCs w:val="28"/>
         </w:rPr>
         <w:t>./.</w:t>
@@ -663,7 +663,7 @@
         <w:widowControl w:val="0"/>
         <w:ind w:firstLine="567"/>
         <w:rPr>
-          <w:rFonts w:ascii="Times New Roman" w:hAnsi="Times New Roman"/>
+          <w:rFonts w:ascii="Times New Roman" w:hAnsi="Times New Roman" w:eastAsia="Times New Roman" w:cs="Times New Roman"/>
           <w:szCs w:val="28"/>
         </w:rPr>
       </w:pPr>
@@ -673,7 +673,7 @@
         <w:widowControl w:val="0"/>
         <w:jc w:val="right"/>
         <w:rPr>
-          <w:rFonts w:ascii="Times New Roman" w:hAnsi="Times New Roman"/>
+          <w:rFonts w:ascii="Times New Roman" w:hAnsi="Times New Roman" w:eastAsia="Times New Roman" w:cs="Times New Roman"/>
           <w:b/>
           <w:sz w:val="26"/>
           <w:szCs w:val="26"/>
@@ -681,7 +681,7 @@
       </w:pPr>
       <w:r>
         <w:rPr>
-          <w:rFonts w:ascii="Times New Roman" w:hAnsi="Times New Roman"/>
+          <w:rFonts w:ascii="Times New Roman" w:hAnsi="Times New Roman" w:eastAsia="Times New Roman" w:cs="Times New Roman"/>
           <w:i/>
           <w:iCs/>
           <w:szCs w:val="28"/>
@@ -690,7 +690,7 @@
       </w:r>
       <w:r>
         <w:rPr>
-          <w:rFonts w:ascii="Times New Roman" w:hAnsi="Times New Roman"/>
+          <w:rFonts w:ascii="Times New Roman" w:hAnsi="Times New Roman" w:eastAsia="Times New Roman" w:cs="Times New Roman"/>
           <w:i/>
           <w:iCs/>
           <w:szCs w:val="28"/>
@@ -699,7 +699,7 @@
       </w:r>
       <w:r>
         <w:rPr>
-          <w:rFonts w:ascii="Times New Roman" w:hAnsi="Times New Roman"/>
+          <w:rFonts w:ascii="Times New Roman" w:hAnsi="Times New Roman" w:eastAsia="Times New Roman" w:cs="Times New Roman"/>
           <w:i/>
           <w:iCs/>
           <w:szCs w:val="28"/>
@@ -709,7 +709,7 @@
       </w:r>
       <w:r>
         <w:rPr>
-          <w:rFonts w:ascii="Times New Roman" w:hAnsi="Times New Roman"/>
+          <w:rFonts w:ascii="Times New Roman" w:hAnsi="Times New Roman" w:eastAsia="Times New Roman" w:cs="Times New Roman"/>
           <w:i/>
           <w:iCs/>
           <w:szCs w:val="28"/>
@@ -718,7 +718,7 @@
       </w:r>
       <w:r>
         <w:rPr>
-          <w:rFonts w:ascii="Times New Roman" w:hAnsi="Times New Roman"/>
+          <w:rFonts w:ascii="Times New Roman" w:hAnsi="Times New Roman" w:eastAsia="Times New Roman" w:cs="Times New Roman"/>
           <w:i/>
           <w:iCs/>
           <w:szCs w:val="28"/>
@@ -728,10 +728,12 @@
     </w:p>
     <w:p>
       <w:pPr>
-        <w:widowControl w:val="0"/>
-        <w:ind w:firstLine="709"/>
-        <w:rPr>
-          <w:rFonts w:ascii="Times New Roman" w:hAnsi="Times New Roman"/>
+        <w:keepNext/>
+        <w:spacing w:before="0" w:after="0" w:line="240" w:lineRule="auto"/>
+        <w:jc w:val="both"/>
+        <w:rPr>
+          <w:rFonts w:ascii="Times New Roman" w:hAnsi="Times New Roman" w:eastAsia="Times New Roman" w:cs="Times New Roman"/>
+          <w:sz w:val="28"/>
           <w:szCs w:val="28"/>
         </w:rPr>
       </w:pPr>
@@ -765,7 +767,7 @@
             <w:pPr>
               <w:widowControl w:val="0"/>
               <w:rPr>
-                <w:rFonts w:ascii="Times New Roman" w:hAnsi="Times New Roman" w:cs="Times New Roman"/>
+                <w:rFonts w:ascii="Times New Roman" w:hAnsi="Times New Roman" w:eastAsia="Times New Roman" w:cs="Times New Roman"/>
                 <w:b/>
                 <w:i/>
                 <w:sz w:val="24"/>
@@ -774,7 +776,7 @@
             </w:pPr>
             <w:r>
               <w:rPr>
-                <w:rFonts w:ascii="Times New Roman" w:hAnsi="Times New Roman" w:cs="Times New Roman"/>
+                <w:rFonts w:ascii="Times New Roman" w:hAnsi="Times New Roman" w:eastAsia="Times New Roman" w:cs="Times New Roman"/>
                 <w:b/>
                 <w:i/>
                 <w:sz w:val="24"/>
@@ -787,21 +789,21 @@
             <w:pPr>
               <w:widowControl w:val="0"/>
               <w:rPr>
-                <w:rFonts w:ascii="Times New Roman" w:hAnsi="Times New Roman" w:cs="Times New Roman"/>
+                <w:rFonts w:ascii="Times New Roman" w:hAnsi="Times New Roman" w:eastAsia="Times New Roman" w:cs="Times New Roman"/>
                 <w:sz w:val="22"/>
                 <w:lang w:val="en-US"/>
               </w:rPr>
             </w:pPr>
             <w:r>
               <w:rPr>
-                <w:rFonts w:ascii="Times New Roman" w:hAnsi="Times New Roman" w:cs="Times New Roman"/>
+                <w:rFonts w:ascii="Times New Roman" w:hAnsi="Times New Roman" w:eastAsia="Times New Roman" w:cs="Times New Roman"/>
                 <w:sz w:val="22"/>
               </w:rPr>
               <w:t xml:space="preserve">- </w:t>
             </w:r>
             <w:r>
               <w:rPr>
-                <w:rFonts w:ascii="Times New Roman" w:hAnsi="Times New Roman" w:cs="Times New Roman"/>
+                <w:rFonts w:ascii="Times New Roman" w:hAnsi="Times New Roman" w:eastAsia="Times New Roman" w:cs="Times New Roman"/>
                 <w:sz w:val="22"/>
                 <w:lang w:val="en-US"/>
               </w:rPr>
@@ -809,14 +811,14 @@
             </w:r>
             <w:r>
               <w:rPr>
-                <w:rFonts w:ascii="Times New Roman" w:hAnsi="Times New Roman" w:cs="Times New Roman"/>
+                <w:rFonts w:ascii="Times New Roman" w:hAnsi="Times New Roman" w:eastAsia="Times New Roman" w:cs="Times New Roman"/>
                 <w:sz w:val="22"/>
               </w:rPr>
               <w:t xml:space="preserve"> (để</w:t>
             </w:r>
             <w:r>
               <w:rPr>
-                <w:rFonts w:ascii="Times New Roman" w:hAnsi="Times New Roman" w:cs="Times New Roman"/>
+                <w:rFonts w:ascii="Times New Roman" w:hAnsi="Times New Roman" w:eastAsia="Times New Roman" w:cs="Times New Roman"/>
                 <w:sz w:val="22"/>
                 <w:lang w:val="en-US"/>
               </w:rPr>
@@ -824,14 +826,14 @@
             </w:r>
             <w:r>
               <w:rPr>
-                <w:rFonts w:ascii="Times New Roman" w:hAnsi="Times New Roman" w:cs="Times New Roman"/>
+                <w:rFonts w:ascii="Times New Roman" w:hAnsi="Times New Roman" w:eastAsia="Times New Roman" w:cs="Times New Roman"/>
                 <w:sz w:val="22"/>
               </w:rPr>
               <w:t>)</w:t>
             </w:r>
             <w:r>
               <w:rPr>
-                <w:rFonts w:ascii="Times New Roman" w:hAnsi="Times New Roman" w:cs="Times New Roman"/>
+                <w:rFonts w:ascii="Times New Roman" w:hAnsi="Times New Roman" w:eastAsia="Times New Roman" w:cs="Times New Roman"/>
                 <w:sz w:val="22"/>
                 <w:lang w:val="en-US"/>
               </w:rPr>
@@ -842,13 +844,13 @@
             <w:pPr>
               <w:widowControl w:val="0"/>
               <w:rPr>
-                <w:rFonts w:ascii="Times New Roman" w:hAnsi="Times New Roman" w:cs="Times New Roman"/>
+                <w:rFonts w:ascii="Times New Roman" w:hAnsi="Times New Roman" w:eastAsia="Times New Roman" w:cs="Times New Roman"/>
                 <w:sz w:val="22"/>
               </w:rPr>
             </w:pPr>
             <w:r>
               <w:rPr>
-                <w:rFonts w:ascii="Times New Roman" w:hAnsi="Times New Roman" w:cs="Times New Roman"/>
+                <w:rFonts w:ascii="Times New Roman" w:hAnsi="Times New Roman" w:eastAsia="Times New Roman" w:cs="Times New Roman"/>
                 <w:sz w:val="22"/>
                 <w:lang w:val="en-US"/>
               </w:rPr>
@@ -859,20 +861,20 @@
             <w:pPr>
               <w:widowControl w:val="0"/>
               <w:rPr>
-                <w:rFonts w:ascii="Times New Roman" w:hAnsi="Times New Roman" w:cs="Times New Roman"/>
+                <w:rFonts w:ascii="Times New Roman" w:hAnsi="Times New Roman" w:eastAsia="Times New Roman" w:cs="Times New Roman"/>
                 <w:sz w:val="22"/>
               </w:rPr>
             </w:pPr>
             <w:r>
               <w:rPr>
-                <w:rFonts w:ascii="Times New Roman" w:hAnsi="Times New Roman" w:cs="Times New Roman"/>
+                <w:rFonts w:ascii="Times New Roman" w:hAnsi="Times New Roman" w:eastAsia="Times New Roman" w:cs="Times New Roman"/>
                 <w:sz w:val="22"/>
               </w:rPr>
               <w:t xml:space="preserve">- Công an </w:t>
             </w:r>
             <w:r>
               <w:rPr>
-                <w:rFonts w:ascii="Times New Roman" w:hAnsi="Times New Roman" w:cs="Times New Roman"/>
+                <w:rFonts w:ascii="Times New Roman" w:hAnsi="Times New Roman" w:eastAsia="Times New Roman" w:cs="Times New Roman"/>
                 <w:sz w:val="22"/>
                 <w:lang w:val="en-US"/>
               </w:rPr>
@@ -880,7 +882,7 @@
             </w:r>
             <w:r>
               <w:rPr>
-                <w:rFonts w:ascii="Times New Roman" w:hAnsi="Times New Roman" w:cs="Times New Roman"/>
+                <w:rFonts w:ascii="Times New Roman" w:hAnsi="Times New Roman" w:eastAsia="Times New Roman" w:cs="Times New Roman"/>
                 <w:sz w:val="22"/>
               </w:rPr>
               <w:t xml:space="preserve"> Lào Cai;</w:t>
@@ -890,13 +892,13 @@
             <w:pPr>
               <w:widowControl w:val="0"/>
               <w:rPr>
-                <w:rFonts w:ascii="Times New Roman" w:hAnsi="Times New Roman" w:cs="Times New Roman"/>
+                <w:rFonts w:ascii="Times New Roman" w:hAnsi="Times New Roman" w:eastAsia="Times New Roman" w:cs="Times New Roman"/>
                 <w:sz w:val="22"/>
               </w:rPr>
             </w:pPr>
             <w:r>
               <w:rPr>
-                <w:rFonts w:ascii="Times New Roman" w:hAnsi="Times New Roman" w:cs="Times New Roman"/>
+                <w:rFonts w:ascii="Times New Roman" w:hAnsi="Times New Roman" w:eastAsia="Times New Roman" w:cs="Times New Roman"/>
                 <w:sz w:val="22"/>
               </w:rPr>
               <w:t>- Sở Xây dựng;</w:t>
@@ -906,13 +908,13 @@
             <w:pPr>
               <w:widowControl w:val="0"/>
               <w:rPr>
-                <w:rFonts w:ascii="Times New Roman" w:hAnsi="Times New Roman" w:cs="Times New Roman"/>
+                <w:rFonts w:ascii="Times New Roman" w:hAnsi="Times New Roman" w:eastAsia="Times New Roman" w:cs="Times New Roman"/>
                 <w:sz w:val="22"/>
               </w:rPr>
             </w:pPr>
             <w:r>
               <w:rPr>
-                <w:rFonts w:ascii="Times New Roman" w:hAnsi="Times New Roman" w:cs="Times New Roman"/>
+                <w:rFonts w:ascii="Times New Roman" w:hAnsi="Times New Roman" w:eastAsia="Times New Roman" w:cs="Times New Roman"/>
                 <w:sz w:val="22"/>
               </w:rPr>
               <w:t>- (tên tổ chức được cấp phép);</w:t>
@@ -922,67 +924,36 @@
             <w:pPr>
               <w:widowControl w:val="0"/>
               <w:rPr>
-                <w:rFonts w:ascii="Times New Roman" w:hAnsi="Times New Roman" w:cs="Times New Roman"/>
+                <w:rFonts w:ascii="Times New Roman" w:hAnsi="Times New Roman" w:eastAsia="Times New Roman" w:cs="Times New Roman"/>
                 <w:sz w:val="22"/>
+                <w:szCs w:val="22"/>
               </w:rPr>
             </w:pPr>
             <w:r>
               <w:rPr>
-                <w:rFonts w:ascii="Times New Roman" w:hAnsi="Times New Roman" w:cs="Times New Roman"/>
+                <w:rFonts w:ascii="Times New Roman" w:hAnsi="Times New Roman" w:eastAsia="Times New Roman" w:cs="Times New Roman"/>
                 <w:sz w:val="22"/>
               </w:rPr>
-              <w:t xml:space="preserve">- </w:t>
-            </w:r>
-            <w:r>
-              <w:rPr>
-                <w:rFonts w:ascii="Times New Roman" w:hAnsi="Times New Roman" w:cs="Times New Roman"/>
+              <w:t xml:space="preserve">- Lưu: VT, </w:t>
+            </w:r>
+            <w:r>
+              <w:rPr>
+                <w:rFonts w:ascii="Times New Roman" w:hAnsi="Times New Roman" w:eastAsia="Times New Roman" w:cs="Times New Roman"/>
+                <w:sz w:val="22"/>
+              </w:rPr>
+              <w:t>BP1C</w:t>
+            </w:r>
+            <w:r>
+              <w:rPr>
+                <w:rFonts w:ascii="Times New Roman" w:hAnsi="Times New Roman" w:eastAsia="Times New Roman" w:cs="Times New Roman"/>
                 <w:sz w:val="22"/>
                 <w:lang w:val="en-US"/>
               </w:rPr>
-              <w:t xml:space="preserve">Ban </w:t>
-            </w:r>
-            <w:r>
-              <w:rPr>
-                <w:rFonts w:ascii="Times New Roman" w:hAnsi="Times New Roman" w:cs="Times New Roman"/>
-                <w:sz w:val="22"/>
-              </w:rPr>
-              <w:t>GĐ Sở;</w:t>
-            </w:r>
-          </w:p>
-          <w:p>
-            <w:pPr>
-              <w:widowControl w:val="0"/>
-              <w:rPr>
-                <w:rFonts w:ascii="Times New Roman" w:hAnsi="Times New Roman" w:cs="Times New Roman"/>
-                <w:sz w:val="26"/>
-                <w:szCs w:val="26"/>
-              </w:rPr>
-            </w:pPr>
-            <w:r>
-              <w:rPr>
-                <w:rFonts w:ascii="Times New Roman" w:hAnsi="Times New Roman" w:cs="Times New Roman"/>
-                <w:sz w:val="22"/>
-              </w:rPr>
-              <w:t xml:space="preserve">- Lưu: VT, </w:t>
-            </w:r>
-            <w:r>
-              <w:rPr>
-                <w:rFonts w:ascii="Times New Roman" w:hAnsi="Times New Roman" w:cs="Times New Roman"/>
-                <w:sz w:val="22"/>
-              </w:rPr>
-              <w:t>BP1C</w:t>
-            </w:r>
-            <w:r>
-              <w:rPr>
-                <w:rFonts w:ascii="Times New Roman" w:hAnsi="Times New Roman" w:cs="Times New Roman"/>
-                <w:sz w:val="22"/>
-                <w:lang w:val="en-US"/>
-              </w:rPr>
               <w:t xml:space="preserve">, </w:t>
             </w:r>
             <w:r>
               <w:rPr>
-                <w:rFonts w:ascii="Times New Roman" w:hAnsi="Times New Roman" w:cs="Times New Roman"/>
+                <w:rFonts w:ascii="Times New Roman" w:hAnsi="Times New Roman" w:eastAsia="Times New Roman" w:cs="Times New Roman"/>
                 <w:sz w:val="22"/>
                 <w:lang w:val="en-US"/>
               </w:rPr>
@@ -1005,7 +976,7 @@
               <w:widowControl w:val="0"/>
               <w:jc w:val="center"/>
               <w:rPr>
-                <w:rFonts w:ascii="Times New Roman" w:hAnsi="Times New Roman" w:cs="Times New Roman"/>
+                <w:rFonts w:ascii="Times New Roman" w:hAnsi="Times New Roman" w:eastAsia="Times New Roman" w:cs="Times New Roman"/>
                 <w:b/>
                 <w:sz w:val="26"/>
                 <w:szCs w:val="26"/>
@@ -1013,7 +984,7 @@
             </w:pPr>
             <w:r>
               <w:rPr>
-                <w:rFonts w:ascii="Times New Roman" w:hAnsi="Times New Roman" w:cs="Times New Roman"/>
+                <w:rFonts w:ascii="Times New Roman" w:hAnsi="Times New Roman" w:eastAsia="Times New Roman" w:cs="Times New Roman"/>
                 <w:b/>
                 <w:sz w:val="26"/>
                 <w:szCs w:val="26"/>
@@ -1026,7 +997,7 @@
               <w:widowControl w:val="0"/>
               <w:jc w:val="center"/>
               <w:rPr>
-                <w:rFonts w:ascii="Times New Roman" w:hAnsi="Times New Roman" w:cs="Times New Roman"/>
+                <w:rFonts w:ascii="Times New Roman" w:hAnsi="Times New Roman" w:eastAsia="Times New Roman" w:cs="Times New Roman"/>
                 <w:b/>
                 <w:sz w:val="26"/>
                 <w:szCs w:val="26"/>
@@ -1034,7 +1005,7 @@
             </w:pPr>
             <w:r>
               <w:rPr>
-                <w:rFonts w:ascii="Times New Roman" w:hAnsi="Times New Roman" w:cs="Times New Roman"/>
+                <w:rFonts w:ascii="Times New Roman" w:hAnsi="Times New Roman" w:eastAsia="Times New Roman" w:cs="Times New Roman"/>
                 <w:b/>
                 <w:sz w:val="26"/>
                 <w:szCs w:val="26"/>
@@ -1047,7 +1018,7 @@
               <w:widowControl w:val="0"/>
               <w:jc w:val="center"/>
               <w:rPr>
-                <w:rFonts w:ascii="Times New Roman" w:hAnsi="Times New Roman" w:cs="Times New Roman"/>
+                <w:rFonts w:ascii="Times New Roman" w:hAnsi="Times New Roman" w:eastAsia="Times New Roman" w:cs="Times New Roman"/>
                 <w:b/>
                 <w:szCs w:val="28"/>
               </w:rPr>
@@ -1059,7 +1030,7 @@
               <w:widowControl w:val="0"/>
               <w:outlineLvl w:val="0"/>
               <w:rPr>
-                <w:rFonts w:ascii="Times New Roman" w:hAnsi="Times New Roman" w:cs="Times New Roman"/>
+                <w:rFonts w:ascii="Times New Roman" w:hAnsi="Times New Roman" w:eastAsia="Times New Roman" w:cs="Times New Roman"/>
               </w:rPr>
             </w:pPr>
           </w:p>
@@ -1068,7 +1039,7 @@
               <w:widowControl w:val="0"/>
               <w:jc w:val="center"/>
               <w:rPr>
-                <w:rFonts w:ascii="Times New Roman" w:hAnsi="Times New Roman" w:cs="Times New Roman"/>
+                <w:rFonts w:ascii="Times New Roman" w:hAnsi="Times New Roman" w:eastAsia="Times New Roman" w:cs="Times New Roman"/>
                 <w:lang w:val="x-none" w:eastAsia="x-none"/>
               </w:rPr>
             </w:pPr>
@@ -1078,7 +1049,7 @@
               <w:widowControl w:val="0"/>
               <w:jc w:val="center"/>
               <w:rPr>
-                <w:rFonts w:ascii="Times New Roman" w:hAnsi="Times New Roman" w:cs="Times New Roman"/>
+                <w:rFonts w:ascii="Times New Roman" w:hAnsi="Times New Roman" w:eastAsia="Times New Roman" w:cs="Times New Roman"/>
                 <w:b/>
                 <w:szCs w:val="28"/>
               </w:rPr>
@@ -1089,7 +1060,7 @@
               <w:widowControl w:val="0"/>
               <w:jc w:val="center"/>
               <w:rPr>
-                <w:rFonts w:ascii="Times New Roman" w:hAnsi="Times New Roman" w:cs="Times New Roman"/>
+                <w:rFonts w:ascii="Times New Roman" w:hAnsi="Times New Roman" w:eastAsia="Times New Roman" w:cs="Times New Roman"/>
                 <w:b/>
                 <w:szCs w:val="28"/>
               </w:rPr>
@@ -1100,7 +1071,7 @@
               <w:widowControl w:val="0"/>
               <w:jc w:val="center"/>
               <w:rPr>
-                <w:rFonts w:ascii="Times New Roman" w:hAnsi="Times New Roman" w:cs="Times New Roman"/>
+                <w:rFonts w:ascii="Times New Roman" w:hAnsi="Times New Roman" w:eastAsia="Times New Roman" w:cs="Times New Roman"/>
                 <w:b/>
                 <w:szCs w:val="28"/>
               </w:rPr>
@@ -1111,7 +1082,7 @@
               <w:widowControl w:val="0"/>
               <w:jc w:val="center"/>
               <w:rPr>
-                <w:rFonts w:ascii="Times New Roman" w:hAnsi="Times New Roman" w:cs="Times New Roman"/>
+                <w:rFonts w:ascii="Times New Roman" w:hAnsi="Times New Roman" w:eastAsia="Times New Roman" w:cs="Times New Roman"/>
                 <w:b/>
                 <w:bCs/>
                 <w:szCs w:val="28"/>
@@ -1119,7 +1090,7 @@
             </w:pPr>
             <w:r>
               <w:rPr>
-                <w:rFonts w:ascii="Times New Roman" w:hAnsi="Times New Roman" w:cs="Times New Roman"/>
+                <w:rFonts w:ascii="Times New Roman" w:hAnsi="Times New Roman" w:eastAsia="Times New Roman" w:cs="Times New Roman"/>
                 <w:b/>
                 <w:bCs/>
                 <w:szCs w:val="28"/>
@@ -1134,7 +1105,7 @@
       <w:pPr>
         <w:widowControl w:val="0"/>
         <w:rPr>
-          <w:rFonts w:ascii="Times New Roman" w:hAnsi="Times New Roman"/>
+          <w:rFonts w:ascii="Times New Roman" w:hAnsi="Times New Roman" w:eastAsia="Times New Roman" w:cs="Times New Roman"/>
           <w:b/>
           <w:bCs/>
           <w:iCs/>
@@ -1148,7 +1119,7 @@
         <w:spacing w:line="400" w:lineRule="exact"/>
         <w:jc w:val="center"/>
         <w:rPr>
-          <w:rFonts w:ascii="Times New Roman" w:hAnsi="Times New Roman"/>
+          <w:rFonts w:ascii="Times New Roman" w:hAnsi="Times New Roman" w:eastAsia="Times New Roman" w:cs="Times New Roman"/>
           <w:b/>
           <w:bCs/>
           <w:iCs/>
@@ -1161,7 +1132,7 @@
       <w:pPr>
         <w:jc w:val="left"/>
         <w:rPr>
-          <w:rFonts w:ascii="Times New Roman" w:hAnsi="Times New Roman"/>
+          <w:rFonts w:ascii="Times New Roman" w:hAnsi="Times New Roman" w:eastAsia="Times New Roman" w:cs="Times New Roman"/>
           <w:b/>
           <w:bCs/>
           <w:iCs/>
@@ -1171,7 +1142,7 @@
       </w:pPr>
       <w:r>
         <w:rPr>
-          <w:rFonts w:ascii="Times New Roman" w:hAnsi="Times New Roman"/>
+          <w:rFonts w:ascii="Times New Roman" w:hAnsi="Times New Roman" w:eastAsia="Times New Roman" w:cs="Times New Roman"/>
           <w:b/>
           <w:bCs/>
           <w:iCs/>
@@ -1187,7 +1158,7 @@
         <w:spacing w:line="400" w:lineRule="exact"/>
         <w:jc w:val="center"/>
         <w:rPr>
-          <w:rFonts w:ascii="Times New Roman" w:hAnsi="Times New Roman"/>
+          <w:rFonts w:ascii="Times New Roman" w:hAnsi="Times New Roman" w:eastAsia="Times New Roman" w:cs="Times New Roman"/>
           <w:b/>
           <w:bCs/>
           <w:iCs/>
@@ -1197,7 +1168,7 @@
       </w:pPr>
       <w:r>
         <w:rPr>
-          <w:rFonts w:ascii="Times New Roman" w:hAnsi="Times New Roman"/>
+          <w:rFonts w:ascii="Times New Roman" w:hAnsi="Times New Roman" w:eastAsia="Times New Roman" w:cs="Times New Roman"/>
           <w:b/>
           <w:bCs/>
           <w:iCs/>
@@ -1214,7 +1185,7 @@
         <w:spacing w:line="400" w:lineRule="exact"/>
         <w:jc w:val="center"/>
         <w:rPr>
-          <w:rFonts w:ascii="Times New Roman" w:hAnsi="Times New Roman"/>
+          <w:rFonts w:ascii="Times New Roman" w:hAnsi="Times New Roman" w:eastAsia="Times New Roman" w:cs="Times New Roman"/>
           <w:i/>
           <w:szCs w:val="28"/>
           <w:lang w:val="vi-VN"/>
@@ -1222,7 +1193,7 @@
       </w:pPr>
       <w:r>
         <w:rPr>
-          <w:rFonts w:ascii="Times New Roman" w:hAnsi="Times New Roman"/>
+          <w:rFonts w:ascii="Times New Roman" w:hAnsi="Times New Roman" w:eastAsia="Times New Roman" w:cs="Times New Roman"/>
           <w:i/>
           <w:szCs w:val="28"/>
           <w:lang w:val="vi-VN"/>
@@ -1236,7 +1207,7 @@
         <w:spacing w:line="400" w:lineRule="exact"/>
         <w:jc w:val="center"/>
         <w:rPr>
-          <w:rFonts w:ascii="Times New Roman" w:hAnsi="Times New Roman"/>
+          <w:rFonts w:ascii="Times New Roman" w:hAnsi="Times New Roman" w:eastAsia="Times New Roman" w:cs="Times New Roman"/>
           <w:i/>
           <w:szCs w:val="28"/>
           <w:lang w:val="vi-VN"/>
@@ -1244,7 +1215,7 @@
       </w:pPr>
       <w:r>
         <w:rPr>
-          <w:rFonts w:ascii="Times New Roman" w:hAnsi="Times New Roman"/>
+          <w:rFonts w:ascii="Times New Roman" w:hAnsi="Times New Roman" w:eastAsia="Times New Roman" w:cs="Times New Roman"/>
           <w:i/>
           <w:szCs w:val="28"/>
           <w:lang w:val="vi-VN"/>
@@ -1253,7 +1224,7 @@
       </w:r>
       <w:r>
         <w:rPr>
-          <w:rFonts w:ascii="Times New Roman" w:hAnsi="Times New Roman"/>
+          <w:rFonts w:ascii="Times New Roman" w:hAnsi="Times New Roman" w:eastAsia="Times New Roman" w:cs="Times New Roman"/>
           <w:b/>
           <w:bCs/>
           <w:i/>
@@ -1264,7 +1235,7 @@
       </w:r>
       <w:r>
         <w:rPr>
-          <w:rFonts w:ascii="Times New Roman" w:hAnsi="Times New Roman"/>
+          <w:rFonts w:ascii="Times New Roman" w:hAnsi="Times New Roman" w:eastAsia="Times New Roman" w:cs="Times New Roman"/>
           <w:i/>
           <w:szCs w:val="28"/>
           <w:lang w:val="vi-VN"/>
@@ -1273,7 +1244,7 @@
       </w:r>
       <w:r>
         <w:rPr>
-          <w:rFonts w:ascii="Times New Roman" w:hAnsi="Times New Roman"/>
+          <w:rFonts w:ascii="Times New Roman" w:hAnsi="Times New Roman" w:eastAsia="Times New Roman" w:cs="Times New Roman"/>
           <w:i/>
           <w:szCs w:val="28"/>
         </w:rPr>
@@ -1281,7 +1252,7 @@
       </w:r>
       <w:r>
         <w:rPr>
-          <w:rFonts w:ascii="Times New Roman" w:hAnsi="Times New Roman"/>
+          <w:rFonts w:ascii="Times New Roman" w:hAnsi="Times New Roman" w:eastAsia="Times New Roman" w:cs="Times New Roman"/>
           <w:i/>
           <w:szCs w:val="28"/>
           <w:lang w:val="vi-VN"/>
@@ -1295,7 +1266,7 @@
         <w:spacing w:after="120"/>
         <w:jc w:val="center"/>
         <w:rPr>
-          <w:rFonts w:ascii="Times New Roman" w:hAnsi="Times New Roman"/>
+          <w:rFonts w:ascii="Times New Roman" w:hAnsi="Times New Roman" w:eastAsia="Times New Roman" w:cs="Times New Roman"/>
           <w:i/>
           <w:szCs w:val="28"/>
           <w:lang w:val="vi-VN"/>
@@ -1303,7 +1274,7 @@
       </w:pPr>
       <w:r>
         <w:rPr>
-          <w:rFonts w:ascii="Times New Roman" w:hAnsi="Times New Roman"/>
+          <w:rFonts w:ascii="Times New Roman" w:hAnsi="Times New Roman" w:eastAsia="Times New Roman" w:cs="Times New Roman"/>
           <w:i/>
           <w:noProof/>
           <w:szCs w:val="28"/>
@@ -1400,7 +1371,7 @@
               <w:spacing w:before="120" w:after="120" w:line="300" w:lineRule="exact"/>
               <w:jc w:val="center"/>
               <w:rPr>
-                <w:rFonts w:ascii="Times New Roman" w:hAnsi="Times New Roman" w:cs="Times New Roman"/>
+                <w:rFonts w:ascii="Times New Roman" w:hAnsi="Times New Roman" w:eastAsia="Times New Roman" w:cs="Times New Roman"/>
                 <w:b/>
                 <w:bCs/>
                 <w:iCs/>
@@ -1410,7 +1381,7 @@
             </w:pPr>
             <w:r>
               <w:rPr>
-                <w:rFonts w:ascii="Times New Roman" w:hAnsi="Times New Roman" w:cs="Times New Roman"/>
+                <w:rFonts w:ascii="Times New Roman" w:hAnsi="Times New Roman" w:eastAsia="Times New Roman" w:cs="Times New Roman"/>
                 <w:b/>
                 <w:bCs/>
                 <w:iCs/>
@@ -1432,7 +1403,7 @@
               <w:spacing w:before="120" w:after="120" w:line="300" w:lineRule="exact"/>
               <w:jc w:val="center"/>
               <w:rPr>
-                <w:rFonts w:ascii="Times New Roman" w:hAnsi="Times New Roman" w:cs="Times New Roman"/>
+                <w:rFonts w:ascii="Times New Roman" w:hAnsi="Times New Roman" w:eastAsia="Times New Roman" w:cs="Times New Roman"/>
                 <w:b/>
                 <w:bCs/>
                 <w:iCs/>
@@ -1442,7 +1413,7 @@
             </w:pPr>
             <w:r>
               <w:rPr>
-                <w:rFonts w:ascii="Times New Roman" w:hAnsi="Times New Roman" w:cs="Times New Roman"/>
+                <w:rFonts w:ascii="Times New Roman" w:hAnsi="Times New Roman" w:eastAsia="Times New Roman" w:cs="Times New Roman"/>
                 <w:b/>
                 <w:bCs/>
                 <w:iCs/>
@@ -1464,7 +1435,7 @@
               <w:spacing w:before="120" w:after="120" w:line="300" w:lineRule="exact"/>
               <w:jc w:val="center"/>
               <w:rPr>
-                <w:rFonts w:ascii="Times New Roman" w:hAnsi="Times New Roman" w:cs="Times New Roman"/>
+                <w:rFonts w:ascii="Times New Roman" w:hAnsi="Times New Roman" w:eastAsia="Times New Roman" w:cs="Times New Roman"/>
                 <w:b/>
                 <w:bCs/>
                 <w:iCs/>
@@ -1474,7 +1445,7 @@
             </w:pPr>
             <w:r>
               <w:rPr>
-                <w:rFonts w:ascii="Times New Roman" w:hAnsi="Times New Roman" w:cs="Times New Roman"/>
+                <w:rFonts w:ascii="Times New Roman" w:hAnsi="Times New Roman" w:eastAsia="Times New Roman" w:cs="Times New Roman"/>
                 <w:b/>
                 <w:bCs/>
                 <w:iCs/>
@@ -1496,7 +1467,7 @@
               <w:spacing w:before="120" w:after="120" w:line="300" w:lineRule="exact"/>
               <w:jc w:val="center"/>
               <w:rPr>
-                <w:rFonts w:ascii="Times New Roman" w:hAnsi="Times New Roman" w:cs="Times New Roman"/>
+                <w:rFonts w:ascii="Times New Roman" w:hAnsi="Times New Roman" w:eastAsia="Times New Roman" w:cs="Times New Roman"/>
                 <w:b/>
                 <w:bCs/>
                 <w:iCs/>
@@ -1506,7 +1477,7 @@
             </w:pPr>
             <w:r>
               <w:rPr>
-                <w:rFonts w:ascii="Times New Roman" w:hAnsi="Times New Roman" w:cs="Times New Roman"/>
+                <w:rFonts w:ascii="Times New Roman" w:hAnsi="Times New Roman" w:eastAsia="Times New Roman" w:cs="Times New Roman"/>
                 <w:b/>
                 <w:bCs/>
                 <w:iCs/>
@@ -1528,7 +1499,7 @@
               <w:spacing w:before="120" w:after="120" w:line="300" w:lineRule="exact"/>
               <w:jc w:val="center"/>
               <w:rPr>
-                <w:rFonts w:ascii="Times New Roman" w:hAnsi="Times New Roman" w:cs="Times New Roman"/>
+                <w:rFonts w:ascii="Times New Roman" w:hAnsi="Times New Roman" w:eastAsia="Times New Roman" w:cs="Times New Roman"/>
                 <w:b/>
                 <w:bCs/>
                 <w:iCs/>
@@ -1538,7 +1509,7 @@
             </w:pPr>
             <w:r>
               <w:rPr>
-                <w:rFonts w:ascii="Times New Roman" w:hAnsi="Times New Roman" w:cs="Times New Roman"/>
+                <w:rFonts w:ascii="Times New Roman" w:hAnsi="Times New Roman" w:eastAsia="Times New Roman" w:cs="Times New Roman"/>
                 <w:b/>
                 <w:bCs/>
                 <w:iCs/>
@@ -1560,7 +1531,7 @@
               <w:spacing w:before="120" w:after="120" w:line="300" w:lineRule="exact"/>
               <w:jc w:val="center"/>
               <w:rPr>
-                <w:rFonts w:ascii="Times New Roman" w:hAnsi="Times New Roman" w:cs="Times New Roman"/>
+                <w:rFonts w:ascii="Times New Roman" w:hAnsi="Times New Roman" w:eastAsia="Times New Roman" w:cs="Times New Roman"/>
                 <w:b/>
                 <w:bCs/>
                 <w:iCs/>
@@ -1570,7 +1541,7 @@
             </w:pPr>
             <w:r>
               <w:rPr>
-                <w:rFonts w:ascii="Times New Roman" w:hAnsi="Times New Roman" w:cs="Times New Roman"/>
+                <w:rFonts w:ascii="Times New Roman" w:hAnsi="Times New Roman" w:eastAsia="Times New Roman" w:cs="Times New Roman"/>
                 <w:b/>
                 <w:bCs/>
                 <w:iCs/>
@@ -1592,7 +1563,7 @@
               <w:spacing w:before="120" w:after="120" w:line="300" w:lineRule="exact"/>
               <w:jc w:val="center"/>
               <w:rPr>
-                <w:rFonts w:ascii="Times New Roman" w:hAnsi="Times New Roman" w:cs="Times New Roman"/>
+                <w:rFonts w:ascii="Times New Roman" w:hAnsi="Times New Roman" w:eastAsia="Times New Roman" w:cs="Times New Roman"/>
                 <w:b/>
                 <w:bCs/>
                 <w:iCs/>
@@ -1602,7 +1573,7 @@
             </w:pPr>
             <w:r>
               <w:rPr>
-                <w:rFonts w:ascii="Times New Roman" w:hAnsi="Times New Roman" w:cs="Times New Roman"/>
+                <w:rFonts w:ascii="Times New Roman" w:hAnsi="Times New Roman" w:eastAsia="Times New Roman" w:cs="Times New Roman"/>
                 <w:b/>
                 <w:bCs/>
                 <w:iCs/>
@@ -1629,7 +1600,7 @@
               <w:spacing w:after="120"/>
               <w:jc w:val="center"/>
               <w:rPr>
-                <w:rFonts w:ascii="Times New Roman" w:hAnsi="Times New Roman" w:cs="Times New Roman"/>
+                <w:rFonts w:ascii="Times New Roman" w:hAnsi="Times New Roman" w:eastAsia="Times New Roman" w:cs="Times New Roman"/>
                 <w:iCs/>
                 <w:szCs w:val="28"/>
                 <w:lang w:val="en-US"/>
@@ -1637,7 +1608,7 @@
             </w:pPr>
             <w:r>
               <w:rPr>
-                <w:rFonts w:ascii="Times New Roman" w:hAnsi="Times New Roman" w:cs="Times New Roman"/>
+                <w:rFonts w:ascii="Times New Roman" w:hAnsi="Times New Roman" w:eastAsia="Times New Roman" w:cs="Times New Roman"/>
                 <w:iCs/>
                 <w:szCs w:val="28"/>
                 <w:lang w:val="en-US"/>
@@ -1657,7 +1628,7 @@
               <w:spacing w:after="120"/>
               <w:jc w:val="center"/>
               <w:rPr>
-                <w:rFonts w:ascii="Times New Roman" w:hAnsi="Times New Roman" w:cs="Times New Roman"/>
+                <w:rFonts w:ascii="Times New Roman" w:hAnsi="Times New Roman" w:eastAsia="Times New Roman" w:cs="Times New Roman"/>
                 <w:iCs/>
                 <w:szCs w:val="28"/>
                 <w:lang w:val="en-US"/>
@@ -1665,7 +1636,7 @@
             </w:pPr>
             <w:r>
               <w:rPr>
-                <w:rFonts w:ascii="Times New Roman" w:hAnsi="Times New Roman" w:cs="Times New Roman"/>
+                <w:rFonts w:ascii="Times New Roman" w:hAnsi="Times New Roman" w:eastAsia="Times New Roman" w:cs="Times New Roman"/>
                 <w:szCs w:val="28"/>
                 <w:lang w:val="en-US"/>
               </w:rPr>
@@ -1684,7 +1655,7 @@
               <w:spacing w:after="120"/>
               <w:jc w:val="center"/>
               <w:rPr>
-                <w:rFonts w:ascii="Times New Roman" w:hAnsi="Times New Roman" w:cs="Times New Roman"/>
+                <w:rFonts w:ascii="Times New Roman" w:hAnsi="Times New Roman" w:eastAsia="Times New Roman" w:cs="Times New Roman"/>
                 <w:iCs/>
                 <w:szCs w:val="28"/>
                 <w:lang w:val="en-US"/>
@@ -1692,7 +1663,7 @@
             </w:pPr>
             <w:r>
               <w:rPr>
-                <w:rFonts w:ascii="Times New Roman" w:hAnsi="Times New Roman" w:cs="Times New Roman"/>
+                <w:rFonts w:ascii="Times New Roman" w:hAnsi="Times New Roman" w:eastAsia="Times New Roman" w:cs="Times New Roman"/>
                 <w:szCs w:val="28"/>
               </w:rPr>
               <w:t>1072</w:t>
@@ -1710,7 +1681,7 @@
               <w:spacing w:after="120"/>
               <w:jc w:val="center"/>
               <w:rPr>
-                <w:rFonts w:ascii="Times New Roman" w:hAnsi="Times New Roman" w:cs="Times New Roman"/>
+                <w:rFonts w:ascii="Times New Roman" w:hAnsi="Times New Roman" w:eastAsia="Times New Roman" w:cs="Times New Roman"/>
                 <w:iCs/>
                 <w:szCs w:val="28"/>
                 <w:lang w:val="en-US"/>
@@ -1718,7 +1689,7 @@
             </w:pPr>
             <w:r>
               <w:rPr>
-                <w:rFonts w:ascii="Times New Roman" w:eastAsia="Calibri" w:hAnsi="Times New Roman" w:cs="Times New Roman"/>
+                <w:rFonts w:ascii="Times New Roman" w:hAnsi="Times New Roman" w:eastAsia="Times New Roman" w:cs="Times New Roman"/>
                 <w:bCs/>
                 <w:iCs/>
                 <w:szCs w:val="28"/>
@@ -1739,7 +1710,7 @@
               <w:spacing w:after="120"/>
               <w:jc w:val="center"/>
               <w:rPr>
-                <w:rFonts w:ascii="Times New Roman" w:hAnsi="Times New Roman" w:cs="Times New Roman"/>
+                <w:rFonts w:ascii="Times New Roman" w:hAnsi="Times New Roman" w:eastAsia="Times New Roman" w:cs="Times New Roman"/>
                 <w:iCs/>
                 <w:szCs w:val="28"/>
                 <w:lang w:val="en-US"/>
@@ -1747,7 +1718,7 @@
             </w:pPr>
             <w:r>
               <w:rPr>
-                <w:rFonts w:ascii="Times New Roman" w:hAnsi="Times New Roman" w:cs="Times New Roman"/>
+                <w:rFonts w:ascii="Times New Roman" w:hAnsi="Times New Roman" w:eastAsia="Times New Roman" w:cs="Times New Roman"/>
                 <w:iCs/>
                 <w:szCs w:val="28"/>
                 <w:lang w:val="en-US"/>
@@ -1767,7 +1738,7 @@
               <w:spacing w:after="120"/>
               <w:jc w:val="center"/>
               <w:rPr>
-                <w:rFonts w:ascii="Times New Roman" w:hAnsi="Times New Roman" w:cs="Times New Roman"/>
+                <w:rFonts w:ascii="Times New Roman" w:hAnsi="Times New Roman" w:eastAsia="Times New Roman" w:cs="Times New Roman"/>
                 <w:iCs/>
                 <w:szCs w:val="28"/>
                 <w:lang w:val="en-US"/>
@@ -1775,7 +1746,7 @@
             </w:pPr>
             <w:r>
               <w:rPr>
-                <w:rFonts w:ascii="Times New Roman" w:hAnsi="Times New Roman" w:cs="Times New Roman"/>
+                <w:rFonts w:ascii="Times New Roman" w:hAnsi="Times New Roman" w:eastAsia="Times New Roman" w:cs="Times New Roman"/>
                 <w:iCs/>
                 <w:szCs w:val="28"/>
                 <w:lang w:val="en-US"/>
@@ -1795,7 +1766,7 @@
               <w:spacing w:after="120"/>
               <w:jc w:val="center"/>
               <w:rPr>
-                <w:rFonts w:ascii="Times New Roman" w:hAnsi="Times New Roman" w:cs="Times New Roman"/>
+                <w:rFonts w:ascii="Times New Roman" w:hAnsi="Times New Roman" w:eastAsia="Times New Roman" w:cs="Times New Roman"/>
                 <w:iCs/>
                 <w:szCs w:val="28"/>
                 <w:lang w:val="en-US"/>
@@ -1803,7 +1774,7 @@
             </w:pPr>
             <w:r>
               <w:rPr>
-                <w:rFonts w:ascii="Times New Roman" w:hAnsi="Times New Roman" w:cs="Times New Roman"/>
+                <w:rFonts w:ascii="Times New Roman" w:hAnsi="Times New Roman" w:eastAsia="Times New Roman" w:cs="Times New Roman"/>
                 <w:iCs/>
                 <w:szCs w:val="28"/>
                 <w:lang w:val="en-US"/>
@@ -1817,7 +1788,7 @@
               <w:spacing w:after="120"/>
               <w:jc w:val="center"/>
               <w:rPr>
-                <w:rFonts w:ascii="Times New Roman" w:hAnsi="Times New Roman" w:cs="Times New Roman"/>
+                <w:rFonts w:ascii="Times New Roman" w:hAnsi="Times New Roman" w:eastAsia="Times New Roman" w:cs="Times New Roman"/>
                 <w:iCs/>
                 <w:szCs w:val="28"/>
                 <w:lang w:val="en-US"/>
@@ -1825,7 +1796,7 @@
             </w:pPr>
             <w:r>
               <w:rPr>
-                <w:rFonts w:ascii="Times New Roman" w:hAnsi="Times New Roman" w:cs="Times New Roman"/>
+                <w:rFonts w:ascii="Times New Roman" w:hAnsi="Times New Roman" w:eastAsia="Times New Roman" w:cs="Times New Roman"/>
                 <w:iCs/>
                 <w:szCs w:val="28"/>
                 <w:lang w:val="en-US"/>
@@ -1834,7 +1805,7 @@
             </w:r>
             <w:r>
               <w:rPr>
-                <w:rFonts w:ascii="Times New Roman" w:hAnsi="Times New Roman" w:cs="Times New Roman"/>
+                <w:rFonts w:ascii="Times New Roman" w:hAnsi="Times New Roman" w:eastAsia="Times New Roman" w:cs="Times New Roman"/>
                 <w:iCs/>
                 <w:szCs w:val="28"/>
                 <w:lang w:val="en-US"/>
@@ -1843,7 +1814,7 @@
             </w:r>
             <w:r>
               <w:rPr>
-                <w:rFonts w:ascii="Times New Roman" w:hAnsi="Times New Roman" w:cs="Times New Roman"/>
+                <w:rFonts w:ascii="Times New Roman" w:hAnsi="Times New Roman" w:eastAsia="Times New Roman" w:cs="Times New Roman"/>
                 <w:iCs/>
                 <w:szCs w:val="28"/>
                 <w:lang w:val="en-US"/>
@@ -1852,7 +1823,7 @@
             </w:r>
             <w:r>
               <w:rPr>
-                <w:rFonts w:ascii="Times New Roman" w:hAnsi="Times New Roman" w:cs="Times New Roman"/>
+                <w:rFonts w:ascii="Times New Roman" w:hAnsi="Times New Roman" w:eastAsia="Times New Roman" w:cs="Times New Roman"/>
                 <w:iCs/>
                 <w:szCs w:val="28"/>
                 <w:lang w:val="en-US"/>
@@ -1861,7 +1832,7 @@
             </w:r>
             <w:r>
               <w:rPr>
-                <w:rFonts w:ascii="Times New Roman" w:hAnsi="Times New Roman" w:cs="Times New Roman"/>
+                <w:rFonts w:ascii="Times New Roman" w:hAnsi="Times New Roman" w:eastAsia="Times New Roman" w:cs="Times New Roman"/>
                 <w:iCs/>
                 <w:szCs w:val="28"/>
                 <w:lang w:val="en-US"/>
@@ -1870,7 +1841,7 @@
             </w:r>
             <w:r>
               <w:rPr>
-                <w:rFonts w:ascii="Times New Roman" w:hAnsi="Times New Roman" w:cs="Times New Roman"/>
+                <w:rFonts w:ascii="Times New Roman" w:hAnsi="Times New Roman" w:eastAsia="Times New Roman" w:cs="Times New Roman"/>
                 <w:iCs/>
                 <w:szCs w:val="28"/>
                 <w:lang w:val="en-US"/>
@@ -1879,7 +1850,7 @@
             </w:r>
             <w:r>
               <w:rPr>
-                <w:rFonts w:ascii="Times New Roman" w:hAnsi="Times New Roman" w:cs="Times New Roman"/>
+                <w:rFonts w:ascii="Times New Roman" w:hAnsi="Times New Roman" w:eastAsia="Times New Roman" w:cs="Times New Roman"/>
                 <w:iCs/>
                 <w:szCs w:val="28"/>
                 <w:lang w:val="en-US"/>
@@ -1893,7 +1864,7 @@
               <w:spacing w:after="120"/>
               <w:jc w:val="center"/>
               <w:rPr>
-                <w:rFonts w:ascii="Times New Roman" w:hAnsi="Times New Roman" w:cs="Times New Roman"/>
+                <w:rFonts w:ascii="Times New Roman" w:hAnsi="Times New Roman" w:eastAsia="Times New Roman" w:cs="Times New Roman"/>
                 <w:iCs/>
                 <w:szCs w:val="28"/>
                 <w:lang w:val="en-US"/>
@@ -1901,7 +1872,7 @@
             </w:pPr>
             <w:r>
               <w:rPr>
-                <w:rFonts w:ascii="Times New Roman" w:hAnsi="Times New Roman" w:cs="Times New Roman"/>
+                <w:rFonts w:ascii="Times New Roman" w:hAnsi="Times New Roman" w:eastAsia="Times New Roman" w:cs="Times New Roman"/>
                 <w:iCs/>
                 <w:szCs w:val="28"/>
                 <w:lang w:val="en-US"/>
@@ -1910,7 +1881,7 @@
             </w:r>
             <w:r>
               <w:rPr>
-                <w:rFonts w:ascii="Times New Roman" w:hAnsi="Times New Roman" w:cs="Times New Roman"/>
+                <w:rFonts w:ascii="Times New Roman" w:hAnsi="Times New Roman" w:eastAsia="Times New Roman" w:cs="Times New Roman"/>
                 <w:iCs/>
                 <w:szCs w:val="28"/>
                 <w:lang w:val="en-US"/>
@@ -1919,7 +1890,7 @@
             </w:r>
             <w:r>
               <w:rPr>
-                <w:rFonts w:ascii="Times New Roman" w:hAnsi="Times New Roman" w:cs="Times New Roman"/>
+                <w:rFonts w:ascii="Times New Roman" w:hAnsi="Times New Roman" w:eastAsia="Times New Roman" w:cs="Times New Roman"/>
                 <w:iCs/>
                 <w:szCs w:val="28"/>
                 <w:lang w:val="en-US"/>
@@ -1928,7 +1899,7 @@
             </w:r>
             <w:r>
               <w:rPr>
-                <w:rFonts w:ascii="Times New Roman" w:hAnsi="Times New Roman" w:cs="Times New Roman"/>
+                <w:rFonts w:ascii="Times New Roman" w:hAnsi="Times New Roman" w:eastAsia="Times New Roman" w:cs="Times New Roman"/>
                 <w:iCs/>
                 <w:szCs w:val="28"/>
                 <w:lang w:val="en-US"/>
@@ -1937,7 +1908,7 @@
             </w:r>
             <w:r>
               <w:rPr>
-                <w:rFonts w:ascii="Times New Roman" w:hAnsi="Times New Roman" w:cs="Times New Roman"/>
+                <w:rFonts w:ascii="Times New Roman" w:hAnsi="Times New Roman" w:eastAsia="Times New Roman" w:cs="Times New Roman"/>
                 <w:iCs/>
                 <w:szCs w:val="28"/>
                 <w:lang w:val="en-US"/>
@@ -1951,7 +1922,7 @@
               <w:spacing w:after="120"/>
               <w:jc w:val="center"/>
               <w:rPr>
-                <w:rFonts w:ascii="Times New Roman" w:hAnsi="Times New Roman" w:cs="Times New Roman"/>
+                <w:rFonts w:ascii="Times New Roman" w:hAnsi="Times New Roman" w:eastAsia="Times New Roman" w:cs="Times New Roman"/>
                 <w:b/>
                 <w:bCs/>
                 <w:szCs w:val="28"/>
@@ -1960,7 +1931,7 @@
             </w:pPr>
             <w:r>
               <w:rPr>
-                <w:rFonts w:ascii="Times New Roman" w:hAnsi="Times New Roman" w:cs="Times New Roman"/>
+                <w:rFonts w:ascii="Times New Roman" w:hAnsi="Times New Roman" w:eastAsia="Times New Roman" w:cs="Times New Roman"/>
                 <w:iCs/>
                 <w:szCs w:val="28"/>
                 <w:lang w:val="en-US"/>
@@ -1969,7 +1940,7 @@
             </w:r>
             <w:r>
               <w:rPr>
-                <w:rFonts w:ascii="Times New Roman" w:hAnsi="Times New Roman" w:cs="Times New Roman"/>
+                <w:rFonts w:ascii="Times New Roman" w:hAnsi="Times New Roman" w:eastAsia="Times New Roman" w:cs="Times New Roman"/>
                 <w:iCs/>
                 <w:szCs w:val="28"/>
                 <w:lang w:val="en-US"/>
@@ -1978,7 +1949,7 @@
             </w:r>
             <w:r>
               <w:rPr>
-                <w:rFonts w:ascii="Times New Roman" w:hAnsi="Times New Roman" w:cs="Times New Roman"/>
+                <w:rFonts w:ascii="Times New Roman" w:hAnsi="Times New Roman" w:eastAsia="Times New Roman" w:cs="Times New Roman"/>
                 <w:iCs/>
                 <w:szCs w:val="28"/>
                 <w:lang w:val="en-US"/>
@@ -1987,7 +1958,7 @@
             </w:r>
             <w:r>
               <w:rPr>
-                <w:rFonts w:ascii="Times New Roman" w:hAnsi="Times New Roman" w:cs="Times New Roman"/>
+                <w:rFonts w:ascii="Times New Roman" w:hAnsi="Times New Roman" w:eastAsia="Times New Roman" w:cs="Times New Roman"/>
                 <w:iCs/>
                 <w:szCs w:val="28"/>
                 <w:lang w:val="en-US"/>
@@ -1996,7 +1967,7 @@
             </w:r>
             <w:r>
               <w:rPr>
-                <w:rFonts w:ascii="Times New Roman" w:hAnsi="Times New Roman" w:cs="Times New Roman"/>
+                <w:rFonts w:ascii="Times New Roman" w:hAnsi="Times New Roman" w:eastAsia="Times New Roman" w:cs="Times New Roman"/>
                 <w:iCs/>
                 <w:szCs w:val="28"/>
                 <w:lang w:val="en-US"/>
@@ -2021,7 +1992,7 @@
               <w:spacing w:after="120"/>
               <w:jc w:val="center"/>
               <w:rPr>
-                <w:rFonts w:ascii="Times New Roman" w:hAnsi="Times New Roman"/>
+                <w:rFonts w:ascii="Times New Roman" w:hAnsi="Times New Roman" w:eastAsia="Times New Roman" w:cs="Times New Roman"/>
                 <w:iCs/>
                 <w:szCs w:val="28"/>
                 <w:lang w:val="en-US"/>
@@ -2029,7 +2000,7 @@
             </w:pPr>
             <w:r>
               <w:rPr>
-                <w:rFonts w:ascii="Times New Roman" w:hAnsi="Times New Roman"/>
+                <w:rFonts w:ascii="Times New Roman" w:hAnsi="Times New Roman" w:eastAsia="Times New Roman" w:cs="Times New Roman"/>
                 <w:iCs/>
                 <w:szCs w:val="28"/>
                 <w:lang w:val="en-US"/>
@@ -2049,12 +2020,13 @@
               <w:spacing w:after="120"/>
               <w:jc w:val="center"/>
               <w:rPr>
-                <w:rFonts w:ascii="Times New Roman" w:hAnsi="Times New Roman"/>
+                <w:rFonts w:ascii="Times New Roman" w:hAnsi="Times New Roman" w:eastAsia="Times New Roman" w:cs="Times New Roman"/>
                 <w:szCs w:val="28"/>
               </w:rPr>
             </w:pPr>
             <w:r>
               <w:rPr>
+                <w:rFonts w:ascii="Times New Roman" w:hAnsi="Times New Roman" w:eastAsia="Times New Roman" w:cs="Times New Roman"/>
                 <w:color w:val="222222"/>
                 <w:szCs w:val="28"/>
                 <w:shd w:val="clear" w:color="auto" w:fill="FFFFFF"/>
@@ -2063,7 +2035,7 @@
             </w:r>
             <w:r>
               <w:rPr>
-                <w:rFonts w:cs="Times New Roman"/>
+                <w:rFonts w:ascii="Times New Roman" w:hAnsi="Times New Roman" w:eastAsia="Times New Roman" w:cs="Times New Roman"/>
                 <w:color w:val="222222"/>
                 <w:szCs w:val="28"/>
                 <w:shd w:val="clear" w:color="auto" w:fill="FFFFFF"/>
@@ -2072,6 +2044,7 @@
             </w:r>
             <w:r>
               <w:rPr>
+                <w:rFonts w:ascii="Times New Roman" w:hAnsi="Times New Roman" w:eastAsia="Times New Roman" w:cs="Times New Roman"/>
                 <w:color w:val="222222"/>
                 <w:szCs w:val="28"/>
                 <w:shd w:val="clear" w:color="auto" w:fill="FFFFFF"/>
@@ -2091,13 +2064,13 @@
               <w:spacing w:after="120"/>
               <w:jc w:val="center"/>
               <w:rPr>
-                <w:rFonts w:ascii="Times New Roman" w:hAnsi="Times New Roman"/>
+                <w:rFonts w:ascii="Times New Roman" w:hAnsi="Times New Roman" w:eastAsia="Times New Roman" w:cs="Times New Roman"/>
                 <w:szCs w:val="28"/>
               </w:rPr>
             </w:pPr>
             <w:r>
               <w:rPr>
-                <w:rFonts w:cs="Times New Roman"/>
+                <w:rFonts w:ascii="Times New Roman" w:hAnsi="Times New Roman" w:eastAsia="Times New Roman" w:cs="Times New Roman"/>
                 <w:sz w:val="26"/>
                 <w:szCs w:val="26"/>
               </w:rPr>
@@ -2105,7 +2078,7 @@
             </w:r>
             <w:r>
               <w:rPr>
-                <w:rFonts w:cs="Times New Roman"/>
+                <w:rFonts w:ascii="Times New Roman" w:hAnsi="Times New Roman" w:eastAsia="Times New Roman" w:cs="Times New Roman"/>
                 <w:sz w:val="26"/>
                 <w:szCs w:val="26"/>
               </w:rPr>
@@ -2124,13 +2097,16 @@
               <w:spacing w:after="120"/>
               <w:jc w:val="center"/>
               <w:rPr>
-                <w:rFonts w:ascii="Times New Roman" w:eastAsia="Calibri" w:hAnsi="Times New Roman"/>
+                <w:rFonts w:ascii="Times New Roman" w:hAnsi="Times New Roman" w:eastAsia="Times New Roman" w:cs="Times New Roman"/>
                 <w:bCs/>
                 <w:iCs/>
                 <w:szCs w:val="28"/>
               </w:rPr>
             </w:pPr>
             <w:r>
+              <w:rPr>
+                <w:rFonts w:ascii="Times New Roman" w:hAnsi="Times New Roman" w:eastAsia="Times New Roman" w:cs="Times New Roman"/>
+              </w:rPr>
               <w:t>2</w:t>
             </w:r>
           </w:p>
@@ -2146,12 +2122,15 @@
               <w:spacing w:after="120"/>
               <w:jc w:val="center"/>
               <w:rPr>
-                <w:rFonts w:ascii="Times New Roman" w:hAnsi="Times New Roman"/>
+                <w:rFonts w:ascii="Times New Roman" w:hAnsi="Times New Roman" w:eastAsia="Times New Roman" w:cs="Times New Roman"/>
                 <w:iCs/>
                 <w:szCs w:val="28"/>
               </w:rPr>
             </w:pPr>
             <w:r>
+              <w:rPr>
+                <w:rFonts w:ascii="Times New Roman" w:hAnsi="Times New Roman" w:eastAsia="Times New Roman" w:cs="Times New Roman"/>
+              </w:rPr>
               <w:t>225</w:t>
             </w:r>
           </w:p>
@@ -2167,14 +2146,14 @@
               <w:spacing w:after="120"/>
               <w:jc w:val="center"/>
               <w:rPr>
-                <w:rFonts w:ascii="Times New Roman" w:hAnsi="Times New Roman"/>
+                <w:rFonts w:ascii="Times New Roman" w:hAnsi="Times New Roman" w:eastAsia="Times New Roman" w:cs="Times New Roman"/>
                 <w:iCs/>
                 <w:szCs w:val="28"/>
               </w:rPr>
             </w:pPr>
             <w:r>
               <w:rPr>
-                <w:rFonts w:ascii="Times New Roman" w:hAnsi="Times New Roman" w:cs="Times New Roman"/>
+                <w:rFonts w:ascii="Times New Roman" w:hAnsi="Times New Roman" w:eastAsia="Times New Roman" w:cs="Times New Roman"/>
                 <w:iCs/>
                 <w:szCs w:val="28"/>
                 <w:lang w:val="en-US"/>
@@ -2194,7 +2173,7 @@
               <w:spacing w:after="120"/>
               <w:jc w:val="center"/>
               <w:rPr>
-                <w:rFonts w:ascii="Times New Roman" w:hAnsi="Times New Roman" w:cs="Times New Roman"/>
+                <w:rFonts w:ascii="Times New Roman" w:hAnsi="Times New Roman" w:eastAsia="Times New Roman" w:cs="Times New Roman"/>
                 <w:iCs/>
                 <w:szCs w:val="28"/>
                 <w:lang w:val="en-US"/>
@@ -2202,7 +2181,7 @@
             </w:pPr>
             <w:r>
               <w:rPr>
-                <w:rFonts w:ascii="Times New Roman" w:hAnsi="Times New Roman" w:cs="Times New Roman"/>
+                <w:rFonts w:ascii="Times New Roman" w:hAnsi="Times New Roman" w:eastAsia="Times New Roman" w:cs="Times New Roman"/>
                 <w:iCs/>
                 <w:szCs w:val="28"/>
                 <w:lang w:val="en-US"/>
@@ -2215,13 +2194,13 @@
               <w:spacing w:before="60" w:after="60" w:line="276" w:lineRule="auto"/>
               <w:jc w:val="center"/>
               <w:rPr>
-                <w:rFonts w:ascii="Times New Roman" w:eastAsia="Times New Roman" w:hAnsi="Times New Roman" w:cs="Times New Roman"/>
+                <w:rFonts w:ascii="Times New Roman" w:hAnsi="Times New Roman" w:eastAsia="Times New Roman" w:cs="Times New Roman"/>
                 <w:szCs w:val="28"/>
               </w:rPr>
             </w:pPr>
             <w:r>
               <w:rPr>
-                <w:rFonts w:ascii="Times New Roman" w:eastAsia="Times New Roman" w:hAnsi="Times New Roman" w:cs="Times New Roman"/>
+                <w:rFonts w:ascii="Times New Roman" w:hAnsi="Times New Roman" w:eastAsia="Times New Roman" w:cs="Times New Roman"/>
                 <w:szCs w:val="28"/>
                 <w:lang w:val="en-US"/>
               </w:rPr>
@@ -2229,14 +2208,14 @@
             </w:r>
             <w:r>
               <w:rPr>
-                <w:rFonts w:ascii="Times New Roman" w:eastAsia="Times New Roman" w:hAnsi="Times New Roman" w:cs="Times New Roman"/>
+                <w:rFonts w:ascii="Times New Roman" w:hAnsi="Times New Roman" w:eastAsia="Times New Roman" w:cs="Times New Roman"/>
                 <w:szCs w:val="28"/>
               </w:rPr>
               <w:t>Xitec chở oxy lỏng</w:t>
             </w:r>
             <w:r>
               <w:rPr>
-                <w:rFonts w:ascii="Times New Roman" w:hAnsi="Times New Roman" w:cs="Times New Roman"/>
+                <w:rFonts w:ascii="Times New Roman" w:hAnsi="Times New Roman" w:eastAsia="Times New Roman" w:cs="Times New Roman"/>
                 <w:iCs/>
                 <w:szCs w:val="28"/>
                 <w:lang w:val="en-US"/>
@@ -2250,14 +2229,14 @@
               <w:spacing w:after="120"/>
               <w:jc w:val="center"/>
               <w:rPr>
-                <w:rFonts w:ascii="Times New Roman" w:hAnsi="Times New Roman"/>
+                <w:rFonts w:ascii="Times New Roman" w:hAnsi="Times New Roman" w:eastAsia="Times New Roman" w:cs="Times New Roman"/>
                 <w:iCs/>
                 <w:szCs w:val="28"/>
               </w:rPr>
             </w:pPr>
             <w:r>
               <w:rPr>
-                <w:rFonts w:ascii="Times New Roman" w:eastAsia="Times New Roman" w:hAnsi="Times New Roman" w:cs="Times New Roman"/>
+                <w:rFonts w:ascii="Times New Roman" w:hAnsi="Times New Roman" w:eastAsia="Times New Roman" w:cs="Times New Roman"/>
                 <w:szCs w:val="28"/>
               </w:rPr>
               <w:t>(biển kiểm soát)</w:t>
@@ -2272,7 +2251,7 @@
         <w:spacing w:after="120"/>
         <w:jc w:val="center"/>
         <w:rPr>
-          <w:rFonts w:ascii="Times New Roman" w:hAnsi="Times New Roman"/>
+          <w:rFonts w:ascii="Times New Roman" w:hAnsi="Times New Roman" w:eastAsia="Times New Roman" w:cs="Times New Roman"/>
           <w:i/>
           <w:szCs w:val="28"/>
           <w:lang w:val="vi-VN"/>
@@ -2284,7 +2263,7 @@
         <w:widowControl w:val="0"/>
         <w:jc w:val="center"/>
         <w:rPr>
-          <w:rFonts w:ascii="Times New Roman" w:hAnsi="Times New Roman"/>
+          <w:rFonts w:ascii="Times New Roman" w:hAnsi="Times New Roman" w:eastAsia="Times New Roman" w:cs="Times New Roman"/>
           <w:i/>
           <w:szCs w:val="28"/>
           <w:lang w:val="pt-BR"/>
@@ -2308,6 +2287,9 @@
   <w:endnote w:type="separator" w:id="-1">
     <w:p>
       <w:r>
+        <w:rPr>
+          <w:rFonts w:ascii="Times New Roman" w:hAnsi="Times New Roman" w:eastAsia="Times New Roman" w:cs="Times New Roman"/>
+        </w:rPr>
         <w:separator/>
       </w:r>
     </w:p>
@@ -2315,6 +2297,9 @@
   <w:endnote w:type="continuationSeparator" w:id="0">
     <w:p>
       <w:r>
+        <w:rPr>
+          <w:rFonts w:ascii="Times New Roman" w:hAnsi="Times New Roman" w:eastAsia="Times New Roman" w:cs="Times New Roman"/>
+        </w:rPr>
         <w:continuationSeparator/>
       </w:r>
     </w:p>
@@ -2327,6 +2312,9 @@
   <w:footnote w:type="separator" w:id="-1">
     <w:p>
       <w:r>
+        <w:rPr>
+          <w:rFonts w:ascii="Times New Roman" w:hAnsi="Times New Roman" w:eastAsia="Times New Roman" w:cs="Times New Roman"/>
+        </w:rPr>
         <w:separator/>
       </w:r>
     </w:p>
@@ -2334,6 +2322,9 @@
   <w:footnote w:type="continuationSeparator" w:id="0">
     <w:p>
       <w:r>
+        <w:rPr>
+          <w:rFonts w:ascii="Times New Roman" w:hAnsi="Times New Roman" w:eastAsia="Times New Roman" w:cs="Times New Roman"/>
+        </w:rPr>
         <w:continuationSeparator/>
       </w:r>
     </w:p>
@@ -2353,7 +2344,7 @@
     </w:sdtPr>
     <w:sdtEndPr>
       <w:rPr>
-        <w:rFonts w:ascii="Times New Roman" w:hAnsi="Times New Roman"/>
+        <w:rFonts w:ascii="Times New Roman" w:hAnsi="Times New Roman" w:eastAsia="Times New Roman" w:cs="Times New Roman"/>
         <w:noProof/>
       </w:rPr>
     </w:sdtEndPr>
@@ -2363,37 +2354,37 @@
           <w:pStyle w:val="Header"/>
           <w:jc w:val="center"/>
           <w:rPr>
-            <w:rFonts w:ascii="Times New Roman" w:hAnsi="Times New Roman"/>
+            <w:rFonts w:ascii="Times New Roman" w:hAnsi="Times New Roman" w:eastAsia="Times New Roman" w:cs="Times New Roman"/>
           </w:rPr>
         </w:pPr>
         <w:r>
           <w:rPr>
-            <w:rFonts w:ascii="Times New Roman" w:hAnsi="Times New Roman"/>
+            <w:rFonts w:ascii="Times New Roman" w:hAnsi="Times New Roman" w:eastAsia="Times New Roman" w:cs="Times New Roman"/>
           </w:rPr>
           <w:fldChar w:fldCharType="begin"/>
         </w:r>
         <w:r>
           <w:rPr>
-            <w:rFonts w:ascii="Times New Roman" w:hAnsi="Times New Roman"/>
+            <w:rFonts w:ascii="Times New Roman" w:hAnsi="Times New Roman" w:eastAsia="Times New Roman" w:cs="Times New Roman"/>
           </w:rPr>
           <w:instrText xml:space="preserve"> PAGE   \* MERGEFORMAT </w:instrText>
         </w:r>
         <w:r>
           <w:rPr>
-            <w:rFonts w:ascii="Times New Roman" w:hAnsi="Times New Roman"/>
+            <w:rFonts w:ascii="Times New Roman" w:hAnsi="Times New Roman" w:eastAsia="Times New Roman" w:cs="Times New Roman"/>
           </w:rPr>
           <w:fldChar w:fldCharType="separate"/>
         </w:r>
         <w:r>
           <w:rPr>
-            <w:rFonts w:ascii="Times New Roman" w:hAnsi="Times New Roman"/>
+            <w:rFonts w:ascii="Times New Roman" w:hAnsi="Times New Roman" w:eastAsia="Times New Roman" w:cs="Times New Roman"/>
             <w:noProof/>
           </w:rPr>
           <w:t>2</w:t>
         </w:r>
         <w:r>
           <w:rPr>
-            <w:rFonts w:ascii="Times New Roman" w:hAnsi="Times New Roman"/>
+            <w:rFonts w:ascii="Times New Roman" w:hAnsi="Times New Roman" w:eastAsia="Times New Roman" w:cs="Times New Roman"/>
             <w:noProof/>
           </w:rPr>
           <w:fldChar w:fldCharType="end"/>
@@ -2513,7 +2504,7 @@
         <w:ind w:left="340" w:hanging="340"/>
       </w:pPr>
       <w:rPr>
-        <w:rFonts w:ascii="Arial" w:hAnsi="Arial" w:cs="Times New Roman" w:hint="default"/>
+        <w:rFonts w:ascii="Times New Roman" w:hAnsi="Times New Roman" w:eastAsia="Times New Roman" w:cs="Times New Roman"/>
         <w:sz w:val="22"/>
       </w:rPr>
     </w:lvl>
@@ -2529,7 +2520,7 @@
         <w:ind w:left="1156" w:hanging="360"/>
       </w:pPr>
       <w:rPr>
-        <w:rFonts w:ascii="Courier New" w:hAnsi="Courier New" w:cs="Courier New" w:hint="default"/>
+        <w:rFonts w:ascii="Times New Roman" w:hAnsi="Times New Roman" w:eastAsia="Times New Roman" w:cs="Times New Roman"/>
       </w:rPr>
     </w:lvl>
     <w:lvl w:ilvl="2" w:tplc="04090005">
@@ -2574,7 +2565,7 @@
         <w:ind w:left="3316" w:hanging="360"/>
       </w:pPr>
       <w:rPr>
-        <w:rFonts w:ascii="Courier New" w:hAnsi="Courier New" w:cs="Courier New" w:hint="default"/>
+        <w:rFonts w:ascii="Times New Roman" w:hAnsi="Times New Roman" w:eastAsia="Times New Roman" w:cs="Times New Roman"/>
       </w:rPr>
     </w:lvl>
     <w:lvl w:ilvl="5" w:tplc="04090005">
@@ -2619,7 +2610,7 @@
         <w:ind w:left="5476" w:hanging="360"/>
       </w:pPr>
       <w:rPr>
-        <w:rFonts w:ascii="Courier New" w:hAnsi="Courier New" w:cs="Courier New" w:hint="default"/>
+        <w:rFonts w:ascii="Times New Roman" w:hAnsi="Times New Roman" w:eastAsia="Times New Roman" w:cs="Times New Roman"/>
       </w:rPr>
     </w:lvl>
     <w:lvl w:ilvl="8" w:tplc="04090005">
@@ -2653,7 +2644,7 @@
         <w:ind w:left="927" w:hanging="360"/>
       </w:pPr>
       <w:rPr>
-        <w:rFonts w:hint="default"/>
+        <w:rFonts w:ascii="Times New Roman" w:hAnsi="Times New Roman" w:eastAsia="Times New Roman" w:cs="Times New Roman"/>
       </w:rPr>
     </w:lvl>
   </w:abstractNum>
@@ -2670,7 +2661,7 @@
         <w:ind w:left="927" w:hanging="360"/>
       </w:pPr>
       <w:rPr>
-        <w:rFonts w:hint="default"/>
+        <w:rFonts w:ascii="Times New Roman" w:hAnsi="Times New Roman" w:eastAsia="Times New Roman" w:cs="Times New Roman"/>
         <w:i w:val="0"/>
       </w:rPr>
     </w:lvl>
@@ -2763,7 +2754,7 @@
         <w:ind w:left="720" w:hanging="360"/>
       </w:pPr>
       <w:rPr>
-        <w:rFonts w:ascii="Times New Roman" w:eastAsia="Times New Roman" w:hAnsi="Times New Roman" w:cs="Times New Roman" w:hint="default"/>
+        <w:rFonts w:ascii="Times New Roman" w:hAnsi="Times New Roman" w:eastAsia="Times New Roman" w:cs="Times New Roman"/>
       </w:rPr>
     </w:lvl>
     <w:lvl w:ilvl="1" w:tplc="04090003" w:tentative="1">
@@ -2778,7 +2769,7 @@
         <w:ind w:left="1440" w:hanging="360"/>
       </w:pPr>
       <w:rPr>
-        <w:rFonts w:ascii="Courier New" w:hAnsi="Courier New" w:cs="Courier New" w:hint="default"/>
+        <w:rFonts w:ascii="Times New Roman" w:hAnsi="Times New Roman" w:eastAsia="Times New Roman" w:cs="Times New Roman"/>
       </w:rPr>
     </w:lvl>
     <w:lvl w:ilvl="2" w:tplc="04090005" w:tentative="1">
@@ -2823,7 +2814,7 @@
         <w:ind w:left="3600" w:hanging="360"/>
       </w:pPr>
       <w:rPr>
-        <w:rFonts w:ascii="Courier New" w:hAnsi="Courier New" w:cs="Courier New" w:hint="default"/>
+        <w:rFonts w:ascii="Times New Roman" w:hAnsi="Times New Roman" w:eastAsia="Times New Roman" w:cs="Times New Roman"/>
       </w:rPr>
     </w:lvl>
     <w:lvl w:ilvl="5" w:tplc="04090005" w:tentative="1">
@@ -2868,7 +2859,7 @@
         <w:ind w:left="5760" w:hanging="360"/>
       </w:pPr>
       <w:rPr>
-        <w:rFonts w:ascii="Courier New" w:hAnsi="Courier New" w:cs="Courier New" w:hint="default"/>
+        <w:rFonts w:ascii="Times New Roman" w:hAnsi="Times New Roman" w:eastAsia="Times New Roman" w:cs="Times New Roman"/>
       </w:rPr>
     </w:lvl>
     <w:lvl w:ilvl="8" w:tplc="04090005" w:tentative="1">
@@ -2900,7 +2891,7 @@
         <w:ind w:left="899" w:hanging="360"/>
       </w:pPr>
       <w:rPr>
-        <w:rFonts w:ascii="Times New Roman" w:eastAsia="Times New Roman" w:hAnsi="Times New Roman" w:cs="Times New Roman" w:hint="default"/>
+        <w:rFonts w:ascii="Times New Roman" w:hAnsi="Times New Roman" w:eastAsia="Times New Roman" w:cs="Times New Roman"/>
       </w:rPr>
     </w:lvl>
     <w:lvl w:ilvl="1" w:tplc="04090003" w:tentative="1">
@@ -2912,7 +2903,7 @@
         <w:ind w:left="1619" w:hanging="360"/>
       </w:pPr>
       <w:rPr>
-        <w:rFonts w:ascii="Courier New" w:hAnsi="Courier New" w:cs="Courier New" w:hint="default"/>
+        <w:rFonts w:ascii="Times New Roman" w:hAnsi="Times New Roman" w:eastAsia="Times New Roman" w:cs="Times New Roman"/>
       </w:rPr>
     </w:lvl>
     <w:lvl w:ilvl="2" w:tplc="04090005" w:tentative="1">
@@ -2948,7 +2939,7 @@
         <w:ind w:left="3779" w:hanging="360"/>
       </w:pPr>
       <w:rPr>
-        <w:rFonts w:ascii="Courier New" w:hAnsi="Courier New" w:cs="Courier New" w:hint="default"/>
+        <w:rFonts w:ascii="Times New Roman" w:hAnsi="Times New Roman" w:eastAsia="Times New Roman" w:cs="Times New Roman"/>
       </w:rPr>
     </w:lvl>
     <w:lvl w:ilvl="5" w:tplc="04090005" w:tentative="1">
@@ -2984,7 +2975,7 @@
         <w:ind w:left="5939" w:hanging="360"/>
       </w:pPr>
       <w:rPr>
-        <w:rFonts w:ascii="Courier New" w:hAnsi="Courier New" w:cs="Courier New" w:hint="default"/>
+        <w:rFonts w:ascii="Times New Roman" w:hAnsi="Times New Roman" w:eastAsia="Times New Roman" w:cs="Times New Roman"/>
       </w:rPr>
     </w:lvl>
     <w:lvl w:ilvl="8" w:tplc="04090005" w:tentative="1">
@@ -3102,7 +3093,7 @@
         <w:ind w:left="1002" w:hanging="360"/>
       </w:pPr>
       <w:rPr>
-        <w:rFonts w:hint="default"/>
+        <w:rFonts w:ascii="Times New Roman" w:hAnsi="Times New Roman" w:eastAsia="Times New Roman" w:cs="Times New Roman"/>
       </w:rPr>
     </w:lvl>
   </w:abstractNum>
@@ -3122,7 +3113,7 @@
         <w:ind w:left="927" w:hanging="360"/>
       </w:pPr>
       <w:rPr>
-        <w:rFonts w:hint="default"/>
+        <w:rFonts w:ascii="Times New Roman" w:hAnsi="Times New Roman" w:eastAsia="Times New Roman" w:cs="Times New Roman"/>
       </w:rPr>
     </w:lvl>
   </w:abstractNum>
@@ -3141,7 +3132,7 @@
         <w:ind w:left="1077" w:hanging="360"/>
       </w:pPr>
       <w:rPr>
-        <w:rFonts w:hint="default"/>
+        <w:rFonts w:ascii="Times New Roman" w:hAnsi="Times New Roman" w:eastAsia="Times New Roman" w:cs="Times New Roman"/>
       </w:rPr>
     </w:lvl>
   </w:abstractNum>
@@ -3158,7 +3149,7 @@
         <w:ind w:left="540" w:hanging="360"/>
       </w:pPr>
       <w:rPr>
-        <w:rFonts w:hint="default"/>
+        <w:rFonts w:ascii="Times New Roman" w:hAnsi="Times New Roman" w:eastAsia="Times New Roman" w:cs="Times New Roman"/>
       </w:rPr>
     </w:lvl>
     <w:lvl w:ilvl="1" w:tplc="04090019" w:tentative="1">
@@ -3247,7 +3238,7 @@
         <w:ind w:left="927" w:hanging="360"/>
       </w:pPr>
       <w:rPr>
-        <w:rFonts w:ascii="Times New Roman" w:eastAsia="Times New Roman" w:hAnsi="Times New Roman" w:cs="Times New Roman" w:hint="default"/>
+        <w:rFonts w:ascii="Times New Roman" w:hAnsi="Times New Roman" w:eastAsia="Times New Roman" w:cs="Times New Roman"/>
       </w:rPr>
     </w:lvl>
     <w:lvl w:ilvl="1" w:tplc="04090003" w:tentative="1">
@@ -3259,7 +3250,7 @@
         <w:ind w:left="1647" w:hanging="360"/>
       </w:pPr>
       <w:rPr>
-        <w:rFonts w:ascii="Courier New" w:hAnsi="Courier New" w:cs="Courier New" w:hint="default"/>
+        <w:rFonts w:ascii="Times New Roman" w:hAnsi="Times New Roman" w:eastAsia="Times New Roman" w:cs="Times New Roman"/>
       </w:rPr>
     </w:lvl>
     <w:lvl w:ilvl="2" w:tplc="04090005" w:tentative="1">
@@ -3295,7 +3286,7 @@
         <w:ind w:left="3807" w:hanging="360"/>
       </w:pPr>
       <w:rPr>
-        <w:rFonts w:ascii="Courier New" w:hAnsi="Courier New" w:cs="Courier New" w:hint="default"/>
+        <w:rFonts w:ascii="Times New Roman" w:hAnsi="Times New Roman" w:eastAsia="Times New Roman" w:cs="Times New Roman"/>
       </w:rPr>
     </w:lvl>
     <w:lvl w:ilvl="5" w:tplc="04090005" w:tentative="1">
@@ -3331,7 +3322,7 @@
         <w:ind w:left="5967" w:hanging="360"/>
       </w:pPr>
       <w:rPr>
-        <w:rFonts w:ascii="Courier New" w:hAnsi="Courier New" w:cs="Courier New" w:hint="default"/>
+        <w:rFonts w:ascii="Times New Roman" w:hAnsi="Times New Roman" w:eastAsia="Times New Roman" w:cs="Times New Roman"/>
       </w:rPr>
     </w:lvl>
     <w:lvl w:ilvl="8" w:tplc="04090005" w:tentative="1">
@@ -3363,7 +3354,7 @@
         <w:ind w:left="927" w:hanging="360"/>
       </w:pPr>
       <w:rPr>
-        <w:rFonts w:hint="default"/>
+        <w:rFonts w:ascii="Times New Roman" w:hAnsi="Times New Roman" w:eastAsia="Times New Roman" w:cs="Times New Roman"/>
       </w:rPr>
     </w:lvl>
   </w:abstractNum>
@@ -3383,7 +3374,7 @@
         <w:ind w:left="1002" w:hanging="360"/>
       </w:pPr>
       <w:rPr>
-        <w:rFonts w:hint="default"/>
+        <w:rFonts w:ascii="Times New Roman" w:hAnsi="Times New Roman" w:eastAsia="Times New Roman" w:cs="Times New Roman"/>
       </w:rPr>
     </w:lvl>
   </w:abstractNum>
@@ -3403,7 +3394,7 @@
         <w:ind w:left="1032" w:hanging="390"/>
       </w:pPr>
       <w:rPr>
-        <w:rFonts w:hint="default"/>
+        <w:rFonts w:ascii="Times New Roman" w:hAnsi="Times New Roman" w:eastAsia="Times New Roman" w:cs="Times New Roman"/>
       </w:rPr>
     </w:lvl>
   </w:abstractNum>
@@ -3423,7 +3414,7 @@
         <w:ind w:left="927" w:hanging="360"/>
       </w:pPr>
       <w:rPr>
-        <w:rFonts w:hint="default"/>
+        <w:rFonts w:ascii="Times New Roman" w:hAnsi="Times New Roman" w:eastAsia="Times New Roman" w:cs="Times New Roman"/>
       </w:rPr>
     </w:lvl>
   </w:abstractNum>
@@ -3443,7 +3434,7 @@
         <w:ind w:left="1287" w:hanging="720"/>
       </w:pPr>
       <w:rPr>
-        <w:rFonts w:hint="default"/>
+        <w:rFonts w:ascii="Times New Roman" w:hAnsi="Times New Roman" w:eastAsia="Times New Roman" w:cs="Times New Roman"/>
       </w:rPr>
     </w:lvl>
   </w:abstractNum>
@@ -3462,7 +3453,7 @@
         <w:ind w:left="927" w:hanging="360"/>
       </w:pPr>
       <w:rPr>
-        <w:rFonts w:hint="default"/>
+        <w:rFonts w:ascii="Times New Roman" w:hAnsi="Times New Roman" w:eastAsia="Times New Roman" w:cs="Times New Roman"/>
       </w:rPr>
     </w:lvl>
   </w:abstractNum>
@@ -3479,7 +3470,7 @@
         <w:ind w:left="1080" w:hanging="360"/>
       </w:pPr>
       <w:rPr>
-        <w:rFonts w:hint="default"/>
+        <w:rFonts w:ascii="Times New Roman" w:hAnsi="Times New Roman" w:eastAsia="Times New Roman" w:cs="Times New Roman"/>
       </w:rPr>
     </w:lvl>
     <w:lvl w:ilvl="1" w:tplc="04090019" w:tentative="1">
@@ -3623,7 +3614,7 @@
   <w:docDefaults>
     <w:rPrDefault>
       <w:rPr>
-        <w:rFonts w:ascii="Times New Roman" w:eastAsia="Times New Roman" w:hAnsi="Times New Roman" w:cs="Times New Roman"/>
+        <w:rFonts w:ascii="Times New Roman" w:hAnsi="Times New Roman" w:eastAsia="Times New Roman" w:cs="Times New Roman"/>
         <w:lang w:val="en-US" w:eastAsia="en-US" w:bidi="ar-SA"/>
       </w:rPr>
     </w:rPrDefault>
@@ -4014,7 +4005,7 @@
       <w:jc w:val="both"/>
     </w:pPr>
     <w:rPr>
-      <w:rFonts w:ascii=".VnTime" w:hAnsi=".VnTime"/>
+      <w:rFonts w:ascii="Times New Roman" w:hAnsi="Times New Roman" w:eastAsia="Times New Roman" w:cs="Times New Roman"/>
       <w:sz w:val="28"/>
     </w:rPr>
   </w:style>
@@ -4030,7 +4021,7 @@
       <w:outlineLvl w:val="0"/>
     </w:pPr>
     <w:rPr>
-      <w:rFonts w:ascii=".VnTimeH" w:hAnsi=".VnTimeH"/>
+      <w:rFonts w:ascii="Times New Roman" w:hAnsi="Times New Roman" w:eastAsia="Times New Roman" w:cs="Times New Roman"/>
       <w:b/>
       <w:sz w:val="24"/>
       <w:lang w:val="x-none" w:eastAsia="x-none"/>
@@ -4047,7 +4038,7 @@
       <w:outlineLvl w:val="1"/>
     </w:pPr>
     <w:rPr>
-      <w:rFonts w:ascii=".VnTimeH" w:hAnsi=".VnTimeH"/>
+      <w:rFonts w:ascii="Times New Roman" w:hAnsi="Times New Roman" w:eastAsia="Times New Roman" w:cs="Times New Roman"/>
       <w:b/>
       <w:sz w:val="26"/>
     </w:rPr>
@@ -4077,7 +4068,7 @@
       <w:outlineLvl w:val="3"/>
     </w:pPr>
     <w:rPr>
-      <w:rFonts w:ascii="Times New Roman" w:hAnsi="Times New Roman"/>
+      <w:rFonts w:ascii="Times New Roman" w:hAnsi="Times New Roman" w:eastAsia="Times New Roman" w:cs="Times New Roman"/>
       <w:b/>
     </w:rPr>
   </w:style>
@@ -4094,7 +4085,7 @@
       <w:outlineLvl w:val="4"/>
     </w:pPr>
     <w:rPr>
-      <w:rFonts w:ascii="Times New Roman" w:hAnsi="Times New Roman"/>
+      <w:rFonts w:ascii="Times New Roman" w:hAnsi="Times New Roman" w:eastAsia="Times New Roman" w:cs="Times New Roman"/>
       <w:b/>
       <w:lang w:val="x-none" w:eastAsia="x-none"/>
     </w:rPr>
@@ -4112,7 +4103,7 @@
       <w:outlineLvl w:val="5"/>
     </w:pPr>
     <w:rPr>
-      <w:rFonts w:ascii="Times New Roman" w:hAnsi="Times New Roman"/>
+      <w:rFonts w:ascii="Times New Roman" w:hAnsi="Times New Roman" w:eastAsia="Times New Roman" w:cs="Times New Roman"/>
       <w:b/>
     </w:rPr>
   </w:style>
@@ -4128,7 +4119,7 @@
       <w:outlineLvl w:val="6"/>
     </w:pPr>
     <w:rPr>
-      <w:rFonts w:ascii="Arial" w:hAnsi="Arial"/>
+      <w:rFonts w:ascii="Times New Roman" w:hAnsi="Times New Roman" w:eastAsia="Times New Roman" w:cs="Times New Roman"/>
       <w:b/>
     </w:rPr>
   </w:style>
@@ -4211,7 +4202,7 @@
       <w:jc w:val="center"/>
     </w:pPr>
     <w:rPr>
-      <w:rFonts w:ascii="Times New Roman" w:hAnsi="Times New Roman"/>
+      <w:rFonts w:ascii="Times New Roman" w:hAnsi="Times New Roman" w:eastAsia="Times New Roman" w:cs="Times New Roman"/>
       <w:b/>
       <w:bCs/>
       <w:sz w:val="26"/>
@@ -4241,7 +4232,7 @@
     <w:link w:val="Heading1"/>
     <w:rsid w:val="00D6456D"/>
     <w:rPr>
-      <w:rFonts w:ascii=".VnTimeH" w:hAnsi=".VnTimeH"/>
+      <w:rFonts w:ascii="Times New Roman" w:hAnsi="Times New Roman" w:eastAsia="Times New Roman" w:cs="Times New Roman"/>
       <w:b/>
       <w:sz w:val="24"/>
     </w:rPr>
@@ -4257,7 +4248,7 @@
       <w:jc w:val="left"/>
     </w:pPr>
     <w:rPr>
-      <w:rFonts w:ascii="Times New Roman" w:hAnsi="Times New Roman"/>
+      <w:rFonts w:ascii="Times New Roman" w:hAnsi="Times New Roman" w:eastAsia="Times New Roman" w:cs="Times New Roman"/>
       <w:sz w:val="24"/>
       <w:szCs w:val="24"/>
     </w:rPr>
@@ -4268,7 +4259,7 @@
     <w:uiPriority w:val="99"/>
     <w:rsid w:val="00E134A7"/>
     <w:rPr>
-      <w:rFonts w:ascii=".VnTime" w:hAnsi=".VnTime"/>
+      <w:rFonts w:ascii="Times New Roman" w:hAnsi="Times New Roman" w:eastAsia="Times New Roman" w:cs="Times New Roman"/>
       <w:sz w:val="28"/>
     </w:rPr>
   </w:style>
@@ -4282,7 +4273,7 @@
       <w:ind w:firstLine="720"/>
     </w:pPr>
     <w:rPr>
-      <w:rFonts w:ascii="Times New Roman" w:hAnsi="Times New Roman"/>
+      <w:rFonts w:ascii="Times New Roman" w:hAnsi="Times New Roman" w:eastAsia="Times New Roman" w:cs="Times New Roman"/>
       <w:bCs/>
       <w:szCs w:val="24"/>
     </w:rPr>
@@ -4294,7 +4285,7 @@
       <w:outlineLvl w:val="0"/>
     </w:pPr>
     <w:rPr>
-      <w:rFonts w:eastAsia="ヒラギノ角ゴ Pro W3"/>
+      <w:rFonts w:ascii="Times New Roman" w:hAnsi="Times New Roman" w:eastAsia="Times New Roman" w:cs="Times New Roman"/>
       <w:color w:val="000000"/>
       <w:sz w:val="28"/>
     </w:rPr>
@@ -4317,7 +4308,7 @@
     <w:unhideWhenUsed/>
     <w:rsid w:val="00074306"/>
     <w:rPr>
-      <w:rFonts w:ascii="Segoe UI" w:hAnsi="Segoe UI" w:cs="Segoe UI"/>
+      <w:rFonts w:ascii="Times New Roman" w:hAnsi="Times New Roman" w:eastAsia="Times New Roman" w:cs="Times New Roman"/>
       <w:sz w:val="18"/>
       <w:szCs w:val="18"/>
     </w:rPr>
@@ -4329,7 +4320,7 @@
     <w:semiHidden/>
     <w:rsid w:val="00074306"/>
     <w:rPr>
-      <w:rFonts w:ascii="Segoe UI" w:hAnsi="Segoe UI" w:cs="Segoe UI"/>
+      <w:rFonts w:ascii="Times New Roman" w:hAnsi="Times New Roman" w:eastAsia="Times New Roman" w:cs="Times New Roman"/>
       <w:sz w:val="18"/>
       <w:szCs w:val="18"/>
     </w:rPr>
@@ -4345,7 +4336,7 @@
       <w:spacing w:before="120" w:line="360" w:lineRule="auto"/>
     </w:pPr>
     <w:rPr>
-      <w:rFonts w:ascii=".VnArial" w:hAnsi=".VnArial"/>
+      <w:rFonts w:ascii="Times New Roman" w:hAnsi="Times New Roman" w:eastAsia="Times New Roman" w:cs="Times New Roman"/>
       <w:spacing w:val="5"/>
       <w:sz w:val="22"/>
     </w:rPr>
@@ -4391,7 +4382,7 @@
       <w:jc w:val="left"/>
     </w:pPr>
     <w:rPr>
-      <w:rFonts w:ascii="UVnTime" w:hAnsi="UVnTime"/>
+      <w:rFonts w:ascii="Times New Roman" w:hAnsi="Times New Roman" w:eastAsia="Times New Roman" w:cs="Times New Roman"/>
       <w:sz w:val="26"/>
       <w:szCs w:val="24"/>
     </w:rPr>
@@ -4420,7 +4411,7 @@
     <w:semiHidden/>
     <w:rsid w:val="00DF6C58"/>
     <w:rPr>
-      <w:rFonts w:ascii=".VnTime" w:hAnsi=".VnTime"/>
+      <w:rFonts w:ascii="Times New Roman" w:hAnsi="Times New Roman" w:eastAsia="Times New Roman" w:cs="Times New Roman"/>
       <w:sz w:val="28"/>
     </w:rPr>
   </w:style>
@@ -4442,7 +4433,7 @@
     <w:uiPriority w:val="99"/>
     <w:rsid w:val="00B81254"/>
     <w:rPr>
-      <w:rFonts w:ascii=".VnTime" w:hAnsi=".VnTime"/>
+      <w:rFonts w:ascii="Times New Roman" w:hAnsi="Times New Roman" w:eastAsia="Times New Roman" w:cs="Times New Roman"/>
       <w:sz w:val="28"/>
     </w:rPr>
   </w:style>
@@ -4452,7 +4443,7 @@
     <w:uiPriority w:val="39"/>
     <w:rsid w:val="00260CE7"/>
     <w:rPr>
-      <w:rFonts w:asciiTheme="minorHAnsi" w:eastAsiaTheme="minorEastAsia" w:hAnsiTheme="minorHAnsi" w:cstheme="minorBidi"/>
+      <w:rFonts w:ascii="Times New Roman" w:hAnsi="Times New Roman" w:eastAsia="Times New Roman" w:cs="Times New Roman"/>
       <w:sz w:val="22"/>
       <w:szCs w:val="22"/>
       <w:lang w:val="vi-VN" w:eastAsia="vi-VN"/>
@@ -4475,7 +4466,7 @@
     <w:uiPriority w:val="39"/>
     <w:rsid w:val="00260CE7"/>
     <w:rPr>
-      <w:rFonts w:asciiTheme="minorHAnsi" w:eastAsiaTheme="minorEastAsia" w:hAnsiTheme="minorHAnsi" w:cstheme="minorBidi"/>
+      <w:rFonts w:ascii="Times New Roman" w:hAnsi="Times New Roman" w:eastAsia="Times New Roman" w:cs="Times New Roman"/>
       <w:kern w:val="2"/>
       <w:sz w:val="24"/>
       <w:szCs w:val="24"/>
@@ -4514,7 +4505,7 @@
       <w:jc w:val="left"/>
     </w:pPr>
     <w:rPr>
-      <w:rFonts w:ascii="Times New Roman" w:hAnsi="Times New Roman"/>
+      <w:rFonts w:ascii="Times New Roman" w:hAnsi="Times New Roman" w:eastAsia="Times New Roman" w:cs="Times New Roman"/>
       <w:sz w:val="26"/>
       <w:szCs w:val="26"/>
     </w:rPr>
@@ -4539,7 +4530,7 @@
     <w:semiHidden/>
     <w:rsid w:val="00AB3338"/>
     <w:rPr>
-      <w:rFonts w:ascii=".VnTime" w:hAnsi=".VnTime"/>
+      <w:rFonts w:ascii="Times New Roman" w:hAnsi="Times New Roman" w:eastAsia="Times New Roman" w:cs="Times New Roman"/>
     </w:rPr>
   </w:style>
   <w:style w:type="character" w:styleId="FootnoteReference">
@@ -4610,7 +4601,7 @@
     </a:clrScheme>
     <a:fontScheme name="Office">
       <a:majorFont>
-        <a:latin typeface="Calibri Light" panose="020F0302020204030204"/>
+        <a:latin typeface="Times New Roman" panose="020F0302020204030204"/>
         <a:ea typeface=""/>
         <a:cs typeface=""/>
         <a:font script="Jpan" typeface="游ゴシック Light"/>
@@ -4662,7 +4653,7 @@
         <a:font script="Tfng" typeface="Ebrima"/>
       </a:majorFont>
       <a:minorFont>
-        <a:latin typeface="Calibri" panose="020F0502020204030204"/>
+        <a:latin typeface="Times New Roman" panose="020F0502020204030204"/>
         <a:ea typeface=""/>
         <a:cs typeface=""/>
         <a:font script="Jpan" typeface="游明朝"/>

</xml_diff>